<commit_message>
BLSTM Model part i
</commit_message>
<xml_diff>
--- a/Assignments/Assignment2/Assignment2b/Document/Gamble_Team_Report_Assignment2b.docx
+++ b/Assignments/Assignment2/Assignment2b/Document/Gamble_Team_Report_Assignment2b.docx
@@ -18,6 +18,20 @@
           <w:lang w:val="en-US"/>
         </w:rPr>
       </w:pPr>
+      <w:r>
+        <w:rPr>
+          <w:rFonts w:hint="default" w:ascii="Times New Roman" w:hAnsi="Times New Roman" w:eastAsia="SimSun" w:cs="Times New Roman"/>
+          <w:b w:val="0"/>
+          <w:bCs w:val="0"/>
+          <w:i w:val="0"/>
+          <w:iCs w:val="0"/>
+          <w:color w:val="auto"/>
+          <w:sz w:val="24"/>
+          <w:szCs w:val="24"/>
+          <w:lang w:val="en-US"/>
+        </w:rPr>
+        <w:tab/>
+      </w:r>
     </w:p>
     <w:p>
       <w:pPr>
@@ -915,7 +929,7 @@
         </w:p>
         <w:p>
           <w:pPr>
-            <w:pStyle w:val="20"/>
+            <w:pStyle w:val="21"/>
             <w:bidi w:val="0"/>
             <w:rPr>
               <w:rFonts w:hint="default" w:ascii="Times New Roman" w:hAnsi="Times New Roman" w:eastAsia="SimSun" w:cs="Times New Roman"/>
@@ -938,13 +952,13 @@
         </w:p>
         <w:p>
           <w:pPr>
-            <w:pStyle w:val="25"/>
+            <w:pStyle w:val="26"/>
             <w:tabs>
               <w:tab w:val="right" w:leader="dot" w:pos="8312"/>
             </w:tabs>
             <w:spacing w:line="360" w:lineRule="auto"/>
             <w:rPr>
-              <w:rStyle w:val="28"/>
+              <w:rStyle w:val="29"/>
               <w:rFonts w:hint="default" w:ascii="Times New Roman" w:hAnsi="Times New Roman" w:cs="Times New Roman"/>
               <w:lang w:val="en-US"/>
             </w:rPr>
@@ -999,7 +1013,7 @@
           </w:r>
           <w:r>
             <w:rPr>
-              <w:rStyle w:val="28"/>
+              <w:rStyle w:val="29"/>
               <w:rFonts w:hint="default" w:ascii="Times New Roman" w:hAnsi="Times New Roman" w:cs="Times New Roman"/>
               <w:lang w:val="en-US"/>
             </w:rPr>
@@ -1007,7 +1021,7 @@
           </w:r>
           <w:r>
             <w:rPr>
-              <w:rStyle w:val="28"/>
+              <w:rStyle w:val="29"/>
               <w:rFonts w:hint="default" w:ascii="Times New Roman" w:hAnsi="Times New Roman" w:cs="Times New Roman"/>
               <w:lang w:val="en-US"/>
             </w:rPr>
@@ -1015,7 +1029,7 @@
           </w:r>
           <w:r>
             <w:rPr>
-              <w:rStyle w:val="28"/>
+              <w:rStyle w:val="29"/>
               <w:rFonts w:hint="default" w:ascii="Times New Roman" w:hAnsi="Times New Roman" w:cs="Times New Roman"/>
               <w:lang w:val="en-US"/>
             </w:rPr>
@@ -1023,7 +1037,7 @@
           </w:r>
           <w:r>
             <w:rPr>
-              <w:rStyle w:val="28"/>
+              <w:rStyle w:val="29"/>
               <w:rFonts w:hint="default" w:ascii="Times New Roman" w:hAnsi="Times New Roman" w:cs="Times New Roman"/>
               <w:lang w:val="en-US"/>
             </w:rPr>
@@ -1031,14 +1045,14 @@
           </w:r>
           <w:r>
             <w:rPr>
-              <w:rStyle w:val="28"/>
+              <w:rStyle w:val="29"/>
               <w:rFonts w:hint="default" w:ascii="Times New Roman" w:hAnsi="Times New Roman" w:cs="Times New Roman"/>
             </w:rPr>
             <w:tab/>
           </w:r>
           <w:r>
             <w:rPr>
-              <w:rStyle w:val="28"/>
+              <w:rStyle w:val="29"/>
               <w:rFonts w:hint="default" w:ascii="Times New Roman" w:hAnsi="Times New Roman" w:cs="Times New Roman"/>
               <w:lang w:val="en-US"/>
             </w:rPr>
@@ -1046,7 +1060,7 @@
           </w:r>
           <w:r>
             <w:rPr>
-              <w:rStyle w:val="28"/>
+              <w:rStyle w:val="29"/>
               <w:rFonts w:hint="default" w:ascii="Times New Roman" w:hAnsi="Times New Roman" w:cs="Times New Roman"/>
               <w:sz w:val="32"/>
               <w:szCs w:val="32"/>
@@ -1057,7 +1071,7 @@
         </w:p>
         <w:p>
           <w:pPr>
-            <w:pStyle w:val="25"/>
+            <w:pStyle w:val="26"/>
             <w:tabs>
               <w:tab w:val="right" w:leader="dot" w:pos="8312"/>
             </w:tabs>
@@ -1171,7 +1185,7 @@
         </w:p>
         <w:p>
           <w:pPr>
-            <w:pStyle w:val="25"/>
+            <w:pStyle w:val="26"/>
             <w:tabs>
               <w:tab w:val="right" w:leader="dot" w:pos="8312"/>
             </w:tabs>
@@ -1290,13 +1304,13 @@
         </w:p>
         <w:p>
           <w:pPr>
-            <w:pStyle w:val="25"/>
+            <w:pStyle w:val="26"/>
             <w:tabs>
               <w:tab w:val="right" w:leader="dot" w:pos="8312"/>
             </w:tabs>
             <w:spacing w:line="360" w:lineRule="auto"/>
             <w:rPr>
-              <w:rFonts w:hint="default" w:eastAsia="serif" w:cs="Times New Roman"/>
+              <w:rFonts w:hint="default" w:ascii="Times New Roman" w:hAnsi="Times New Roman" w:eastAsia="serif" w:cs="Times New Roman"/>
               <w:b/>
               <w:bCs/>
               <w:i w:val="0"/>
@@ -1366,7 +1380,7 @@
           </w:r>
           <w:r>
             <w:rPr>
-              <w:rFonts w:hint="default" w:cs="Times New Roman"/>
+              <w:rFonts w:hint="default" w:ascii="Times New Roman" w:hAnsi="Times New Roman" w:cs="Times New Roman"/>
               <w:b/>
               <w:bCs/>
               <w:sz w:val="28"/>
@@ -1388,7 +1402,7 @@
           </w:r>
           <w:r>
             <w:rPr>
-              <w:rFonts w:hint="default" w:cs="Times New Roman"/>
+              <w:rFonts w:hint="default" w:ascii="Times New Roman" w:hAnsi="Times New Roman" w:cs="Times New Roman"/>
               <w:b/>
               <w:bCs/>
               <w:sz w:val="28"/>
@@ -1425,7 +1439,7 @@
           </w:r>
           <w:r>
             <w:rPr>
-              <w:rFonts w:hint="default" w:eastAsia="serif" w:cs="Times New Roman"/>
+              <w:rFonts w:hint="default" w:ascii="Times New Roman" w:hAnsi="Times New Roman" w:eastAsia="serif" w:cs="Times New Roman"/>
               <w:b/>
               <w:bCs/>
               <w:i w:val="0"/>
@@ -1442,13 +1456,13 @@
         </w:p>
         <w:p>
           <w:pPr>
-            <w:pStyle w:val="25"/>
+            <w:pStyle w:val="26"/>
             <w:tabs>
               <w:tab w:val="right" w:leader="dot" w:pos="8312"/>
             </w:tabs>
             <w:spacing w:line="360" w:lineRule="auto"/>
             <w:rPr>
-              <w:rStyle w:val="28"/>
+              <w:rStyle w:val="29"/>
               <w:rFonts w:hint="default" w:ascii="Times New Roman" w:hAnsi="Times New Roman" w:cs="Times New Roman"/>
               <w:lang w:val="en-US"/>
             </w:rPr>
@@ -1503,7 +1517,7 @@
           </w:r>
           <w:r>
             <w:rPr>
-              <w:rStyle w:val="28"/>
+              <w:rStyle w:val="29"/>
               <w:rFonts w:hint="default" w:ascii="Times New Roman" w:hAnsi="Times New Roman" w:cs="Times New Roman"/>
               <w:lang w:val="en-US"/>
             </w:rPr>
@@ -1511,7 +1525,7 @@
           </w:r>
           <w:r>
             <w:rPr>
-              <w:rStyle w:val="28"/>
+              <w:rStyle w:val="29"/>
               <w:rFonts w:hint="default" w:ascii="Times New Roman" w:hAnsi="Times New Roman" w:cs="Times New Roman"/>
               <w:lang w:val="en-US"/>
             </w:rPr>
@@ -1519,7 +1533,7 @@
           </w:r>
           <w:r>
             <w:rPr>
-              <w:rStyle w:val="28"/>
+              <w:rStyle w:val="29"/>
               <w:rFonts w:hint="default" w:ascii="Times New Roman" w:hAnsi="Times New Roman" w:cs="Times New Roman"/>
               <w:lang w:val="en-US"/>
             </w:rPr>
@@ -1527,7 +1541,7 @@
           </w:r>
           <w:r>
             <w:rPr>
-              <w:rStyle w:val="28"/>
+              <w:rStyle w:val="29"/>
               <w:rFonts w:hint="default" w:ascii="Times New Roman" w:hAnsi="Times New Roman" w:cs="Times New Roman"/>
               <w:lang w:val="en-US"/>
             </w:rPr>
@@ -1535,22 +1549,22 @@
           </w:r>
           <w:r>
             <w:rPr>
-              <w:rStyle w:val="28"/>
-              <w:rFonts w:hint="default" w:cs="Times New Roman"/>
+              <w:rStyle w:val="29"/>
+              <w:rFonts w:hint="default" w:ascii="Times New Roman" w:hAnsi="Times New Roman" w:cs="Times New Roman"/>
               <w:lang w:val="en-US"/>
             </w:rPr>
             <w:t>B: Exploratory Data Analysis (EDA)</w:t>
           </w:r>
           <w:r>
             <w:rPr>
-              <w:rStyle w:val="28"/>
+              <w:rStyle w:val="29"/>
               <w:rFonts w:hint="default" w:ascii="Times New Roman" w:hAnsi="Times New Roman" w:cs="Times New Roman"/>
             </w:rPr>
             <w:tab/>
           </w:r>
           <w:r>
             <w:rPr>
-              <w:rStyle w:val="28"/>
+              <w:rStyle w:val="29"/>
               <w:rFonts w:hint="default" w:ascii="Times New Roman" w:hAnsi="Times New Roman" w:cs="Times New Roman"/>
               <w:lang w:val="en-US"/>
             </w:rPr>
@@ -1558,8 +1572,8 @@
           </w:r>
           <w:r>
             <w:rPr>
-              <w:rStyle w:val="28"/>
-              <w:rFonts w:hint="default" w:cs="Times New Roman"/>
+              <w:rStyle w:val="29"/>
+              <w:rFonts w:hint="default" w:ascii="Times New Roman" w:hAnsi="Times New Roman" w:cs="Times New Roman"/>
               <w:lang w:val="en-US"/>
             </w:rPr>
             <w:t>4</w:t>
@@ -1567,13 +1581,13 @@
         </w:p>
         <w:p>
           <w:pPr>
-            <w:pStyle w:val="25"/>
+            <w:pStyle w:val="26"/>
             <w:tabs>
               <w:tab w:val="right" w:leader="dot" w:pos="8312"/>
             </w:tabs>
             <w:spacing w:line="360" w:lineRule="auto"/>
             <w:rPr>
-              <w:rFonts w:hint="default" w:eastAsia="serif" w:cs="Times New Roman"/>
+              <w:rFonts w:hint="default" w:ascii="Times New Roman" w:hAnsi="Times New Roman" w:eastAsia="serif" w:cs="Times New Roman"/>
               <w:b/>
               <w:bCs/>
               <w:i w:val="0"/>
@@ -1632,7 +1646,7 @@
           </w:r>
           <w:r>
             <w:rPr>
-              <w:rFonts w:hint="default" w:eastAsia="serif" w:cs="Times New Roman"/>
+              <w:rFonts w:hint="default" w:ascii="Times New Roman" w:hAnsi="Times New Roman" w:eastAsia="serif" w:cs="Times New Roman"/>
               <w:b/>
               <w:bCs/>
               <w:i w:val="0"/>
@@ -1657,7 +1671,7 @@
           </w:r>
           <w:r>
             <w:rPr>
-              <w:rFonts w:hint="default" w:cs="Times New Roman"/>
+              <w:rFonts w:hint="default" w:ascii="Times New Roman" w:hAnsi="Times New Roman" w:cs="Times New Roman"/>
               <w:b/>
               <w:bCs/>
               <w:sz w:val="28"/>
@@ -1692,10 +1706,26 @@
             </w:rPr>
             <w:fldChar w:fldCharType="end"/>
           </w:r>
+          <w:r>
+            <w:rPr>
+              <w:rFonts w:hint="default" w:ascii="Times New Roman" w:hAnsi="Times New Roman" w:eastAsia="serif" w:cs="Times New Roman"/>
+              <w:b/>
+              <w:bCs/>
+              <w:i w:val="0"/>
+              <w:iCs w:val="0"/>
+              <w:color w:val="000000"/>
+              <w:sz w:val="28"/>
+              <w:szCs w:val="28"/>
+              <w:u w:val="none"/>
+              <w:vertAlign w:val="baseline"/>
+              <w:lang w:val="en-US"/>
+            </w:rPr>
+            <w:t>4</w:t>
+          </w:r>
         </w:p>
         <w:p>
           <w:pPr>
-            <w:pStyle w:val="27"/>
+            <w:pStyle w:val="28"/>
             <w:tabs>
               <w:tab w:val="right" w:leader="dot" w:pos="8312"/>
             </w:tabs>
@@ -1761,7 +1791,7 @@
           </w:r>
           <w:r>
             <w:rPr>
-              <w:rFonts w:hint="default"/>
+              <w:rFonts w:hint="default" w:ascii="Times New Roman" w:hAnsi="Times New Roman" w:cs="Times New Roman"/>
               <w:b/>
               <w:bCs/>
               <w:i w:val="0"/>
@@ -1774,6 +1804,7 @@
           </w:r>
           <w:r>
             <w:rPr>
+              <w:rFonts w:hint="default" w:ascii="Times New Roman" w:hAnsi="Times New Roman" w:cs="Times New Roman"/>
               <w:b/>
               <w:bCs/>
               <w:i w:val="0"/>
@@ -1799,10 +1830,26 @@
             </w:rPr>
             <w:fldChar w:fldCharType="end"/>
           </w:r>
+          <w:r>
+            <w:rPr>
+              <w:rFonts w:hint="default" w:ascii="Times New Roman" w:hAnsi="Times New Roman" w:eastAsia="serif" w:cs="Times New Roman"/>
+              <w:b/>
+              <w:bCs/>
+              <w:i w:val="0"/>
+              <w:iCs w:val="0"/>
+              <w:color w:val="000000"/>
+              <w:sz w:val="26"/>
+              <w:szCs w:val="26"/>
+              <w:u w:val="none"/>
+              <w:vertAlign w:val="baseline"/>
+              <w:lang w:val="en-US"/>
+            </w:rPr>
+            <w:t>4</w:t>
+          </w:r>
         </w:p>
         <w:p>
           <w:pPr>
-            <w:pStyle w:val="27"/>
+            <w:pStyle w:val="28"/>
             <w:tabs>
               <w:tab w:val="right" w:leader="dot" w:pos="8312"/>
             </w:tabs>
@@ -1868,7 +1915,7 @@
           </w:r>
           <w:r>
             <w:rPr>
-              <w:rFonts w:hint="default"/>
+              <w:rFonts w:hint="default" w:ascii="Times New Roman" w:hAnsi="Times New Roman" w:cs="Times New Roman"/>
               <w:b/>
               <w:bCs/>
               <w:i w:val="0"/>
@@ -1881,6 +1928,7 @@
           </w:r>
           <w:r>
             <w:rPr>
+              <w:rFonts w:hint="default" w:ascii="Times New Roman" w:hAnsi="Times New Roman" w:cs="Times New Roman"/>
               <w:b/>
               <w:bCs/>
               <w:i w:val="0"/>
@@ -1906,10 +1954,26 @@
             </w:rPr>
             <w:fldChar w:fldCharType="end"/>
           </w:r>
+          <w:r>
+            <w:rPr>
+              <w:rFonts w:hint="default" w:ascii="Times New Roman" w:hAnsi="Times New Roman" w:eastAsia="serif" w:cs="Times New Roman"/>
+              <w:b/>
+              <w:bCs/>
+              <w:i w:val="0"/>
+              <w:iCs w:val="0"/>
+              <w:color w:val="000000"/>
+              <w:sz w:val="26"/>
+              <w:szCs w:val="26"/>
+              <w:u w:val="none"/>
+              <w:vertAlign w:val="baseline"/>
+              <w:lang w:val="en-US"/>
+            </w:rPr>
+            <w:t>5</w:t>
+          </w:r>
         </w:p>
         <w:p>
           <w:pPr>
-            <w:pStyle w:val="27"/>
+            <w:pStyle w:val="28"/>
             <w:tabs>
               <w:tab w:val="right" w:leader="dot" w:pos="8312"/>
             </w:tabs>
@@ -1975,7 +2039,7 @@
           </w:r>
           <w:r>
             <w:rPr>
-              <w:rFonts w:hint="default"/>
+              <w:rFonts w:hint="default" w:ascii="Times New Roman" w:hAnsi="Times New Roman" w:cs="Times New Roman"/>
               <w:b/>
               <w:bCs/>
               <w:i w:val="0"/>
@@ -1988,6 +2052,7 @@
           </w:r>
           <w:r>
             <w:rPr>
+              <w:rFonts w:hint="default" w:ascii="Times New Roman" w:hAnsi="Times New Roman" w:cs="Times New Roman"/>
               <w:b/>
               <w:bCs/>
               <w:i w:val="0"/>
@@ -2013,10 +2078,26 @@
             </w:rPr>
             <w:fldChar w:fldCharType="end"/>
           </w:r>
+          <w:r>
+            <w:rPr>
+              <w:rFonts w:hint="default" w:ascii="Times New Roman" w:hAnsi="Times New Roman" w:eastAsia="serif" w:cs="Times New Roman"/>
+              <w:b/>
+              <w:bCs/>
+              <w:i w:val="0"/>
+              <w:iCs w:val="0"/>
+              <w:color w:val="000000"/>
+              <w:sz w:val="26"/>
+              <w:szCs w:val="26"/>
+              <w:u w:val="none"/>
+              <w:vertAlign w:val="baseline"/>
+              <w:lang w:val="en-US"/>
+            </w:rPr>
+            <w:t>5</w:t>
+          </w:r>
         </w:p>
         <w:p>
           <w:pPr>
-            <w:pStyle w:val="27"/>
+            <w:pStyle w:val="28"/>
             <w:tabs>
               <w:tab w:val="right" w:leader="dot" w:pos="8312"/>
             </w:tabs>
@@ -2082,7 +2163,7 @@
           </w:r>
           <w:r>
             <w:rPr>
-              <w:rFonts w:hint="default"/>
+              <w:rFonts w:hint="default" w:ascii="Times New Roman" w:hAnsi="Times New Roman" w:cs="Times New Roman"/>
               <w:b/>
               <w:bCs/>
               <w:i w:val="0"/>
@@ -2091,12 +2172,11 @@
               <w:szCs w:val="26"/>
               <w:lang w:val="en-US"/>
             </w:rPr>
-            <w:t>2.1.4  Raw traffic Data Records</w:t>
-          </w:r>
-          <w:bookmarkStart w:id="0" w:name="_GoBack"/>
-          <w:bookmarkEnd w:id="0"/>
-          <w:r>
-            <w:rPr>
+            <w:t>2.1.4  Raw Traffic Data Records</w:t>
+          </w:r>
+          <w:r>
+            <w:rPr>
+              <w:rFonts w:hint="default" w:ascii="Times New Roman" w:hAnsi="Times New Roman" w:cs="Times New Roman"/>
               <w:b/>
               <w:bCs/>
               <w:i w:val="0"/>
@@ -2122,14 +2202,7 @@
             </w:rPr>
             <w:fldChar w:fldCharType="end"/>
           </w:r>
-        </w:p>
-        <w:p>
-          <w:pPr>
-            <w:pStyle w:val="27"/>
-            <w:tabs>
-              <w:tab w:val="right" w:leader="dot" w:pos="8312"/>
-            </w:tabs>
-            <w:spacing w:line="360" w:lineRule="auto"/>
+          <w:r>
             <w:rPr>
               <w:rFonts w:hint="default" w:ascii="Times New Roman" w:hAnsi="Times New Roman" w:eastAsia="serif" w:cs="Times New Roman"/>
               <w:b/>
@@ -2143,17 +2216,40 @@
               <w:vertAlign w:val="baseline"/>
               <w:lang w:val="en-US"/>
             </w:rPr>
+            <w:t>6</w:t>
+          </w:r>
+        </w:p>
+        <w:p>
+          <w:pPr>
+            <w:pStyle w:val="28"/>
+            <w:tabs>
+              <w:tab w:val="right" w:leader="dot" w:pos="8312"/>
+            </w:tabs>
+            <w:spacing w:line="360" w:lineRule="auto"/>
+            <w:rPr>
+              <w:rFonts w:hint="default" w:ascii="Times New Roman" w:hAnsi="Times New Roman" w:eastAsia="serif" w:cs="Times New Roman"/>
+              <w:b/>
+              <w:bCs/>
+              <w:i w:val="0"/>
+              <w:iCs w:val="0"/>
+              <w:color w:val="000000"/>
+              <w:sz w:val="26"/>
+              <w:szCs w:val="26"/>
+              <w:u w:val="none"/>
+              <w:vertAlign w:val="baseline"/>
+              <w:lang w:val="en-US"/>
+            </w:rPr>
           </w:pPr>
         </w:p>
         <w:p>
           <w:pPr>
-            <w:pStyle w:val="25"/>
+            <w:pStyle w:val="26"/>
             <w:tabs>
               <w:tab w:val="right" w:leader="dot" w:pos="8312"/>
             </w:tabs>
             <w:spacing w:line="360" w:lineRule="auto"/>
             <w:rPr>
-              <w:rFonts w:hint="default" w:eastAsia="serif" w:cs="Times New Roman"/>
+              <w:rFonts w:hint="default" w:ascii="Times New Roman" w:hAnsi="Times New Roman" w:eastAsia="serif" w:cs="Times New Roman"/>
               <w:b/>
               <w:bCs/>
               <w:i w:val="0"/>
@@ -2169,13 +2265,13 @@
         </w:p>
         <w:p>
           <w:pPr>
-            <w:pStyle w:val="25"/>
+            <w:pStyle w:val="26"/>
             <w:tabs>
               <w:tab w:val="right" w:leader="dot" w:pos="8312"/>
             </w:tabs>
             <w:spacing w:line="360" w:lineRule="auto"/>
             <w:rPr>
-              <w:rFonts w:hint="default" w:eastAsia="serif" w:cs="Times New Roman"/>
+              <w:rFonts w:hint="default" w:ascii="Times New Roman" w:hAnsi="Times New Roman" w:eastAsia="serif" w:cs="Times New Roman"/>
               <w:b/>
               <w:bCs/>
               <w:i w:val="0"/>
@@ -2499,7 +2595,7 @@
     </w:p>
     <w:tbl>
       <w:tblPr>
-        <w:tblStyle w:val="19"/>
+        <w:tblStyle w:val="20"/>
         <w:tblW w:w="9648" w:type="dxa"/>
         <w:tblInd w:w="-500" w:type="dxa"/>
         <w:tblBorders>
@@ -2738,7 +2834,7 @@
           </w:tcPr>
           <w:p>
             <w:pPr>
-              <w:pStyle w:val="18"/>
+              <w:pStyle w:val="19"/>
               <w:keepNext w:val="0"/>
               <w:keepLines w:val="0"/>
               <w:widowControl/>
@@ -2750,12 +2846,14 @@
               <w:ind w:left="420" w:leftChars="0" w:hanging="420" w:firstLineChars="0"/>
               <w:jc w:val="left"/>
               <w:rPr>
+                <w:rFonts w:hint="default" w:ascii="Times New Roman" w:hAnsi="Times New Roman" w:cs="Times New Roman"/>
                 <w:b w:val="0"/>
                 <w:bCs w:val="0"/>
               </w:rPr>
             </w:pPr>
             <w:r>
               <w:rPr>
+                <w:rFonts w:hint="default" w:ascii="Times New Roman" w:hAnsi="Times New Roman" w:cs="Times New Roman"/>
                 <w:b w:val="0"/>
                 <w:bCs w:val="0"/>
               </w:rPr>
@@ -2764,7 +2862,7 @@
           </w:p>
           <w:p>
             <w:pPr>
-              <w:pStyle w:val="18"/>
+              <w:pStyle w:val="19"/>
               <w:keepNext w:val="0"/>
               <w:keepLines w:val="0"/>
               <w:widowControl/>
@@ -2776,12 +2874,14 @@
               <w:ind w:left="420" w:leftChars="0" w:hanging="420" w:firstLineChars="0"/>
               <w:jc w:val="left"/>
               <w:rPr>
+                <w:rFonts w:hint="default" w:ascii="Times New Roman" w:hAnsi="Times New Roman" w:cs="Times New Roman"/>
                 <w:b w:val="0"/>
                 <w:bCs w:val="0"/>
               </w:rPr>
             </w:pPr>
             <w:r>
               <w:rPr>
+                <w:rFonts w:hint="default" w:ascii="Times New Roman" w:hAnsi="Times New Roman" w:cs="Times New Roman"/>
                 <w:b w:val="0"/>
                 <w:bCs w:val="0"/>
               </w:rPr>
@@ -2790,7 +2890,7 @@
           </w:p>
           <w:p>
             <w:pPr>
-              <w:pStyle w:val="18"/>
+              <w:pStyle w:val="19"/>
               <w:keepNext w:val="0"/>
               <w:keepLines w:val="0"/>
               <w:widowControl/>
@@ -2813,6 +2913,7 @@
             </w:pPr>
             <w:r>
               <w:rPr>
+                <w:rFonts w:hint="default" w:ascii="Times New Roman" w:hAnsi="Times New Roman" w:cs="Times New Roman"/>
                 <w:b w:val="0"/>
                 <w:bCs w:val="0"/>
               </w:rPr>
@@ -2910,7 +3011,7 @@
           </w:tcPr>
           <w:p>
             <w:pPr>
-              <w:pStyle w:val="18"/>
+              <w:pStyle w:val="19"/>
               <w:keepNext w:val="0"/>
               <w:keepLines w:val="0"/>
               <w:widowControl/>
@@ -2922,12 +3023,14 @@
               <w:ind w:left="420" w:leftChars="0" w:hanging="420" w:firstLineChars="0"/>
               <w:jc w:val="left"/>
               <w:rPr>
+                <w:rFonts w:hint="default" w:ascii="Times New Roman" w:hAnsi="Times New Roman" w:cs="Times New Roman"/>
                 <w:b w:val="0"/>
                 <w:bCs w:val="0"/>
               </w:rPr>
             </w:pPr>
             <w:r>
               <w:rPr>
+                <w:rFonts w:hint="default" w:ascii="Times New Roman" w:hAnsi="Times New Roman" w:cs="Times New Roman"/>
                 <w:b w:val="0"/>
                 <w:bCs w:val="0"/>
               </w:rPr>
@@ -2936,7 +3039,7 @@
           </w:p>
           <w:p>
             <w:pPr>
-              <w:pStyle w:val="18"/>
+              <w:pStyle w:val="19"/>
               <w:keepNext w:val="0"/>
               <w:keepLines w:val="0"/>
               <w:widowControl/>
@@ -2948,12 +3051,14 @@
               <w:ind w:left="420" w:leftChars="0" w:hanging="420" w:firstLineChars="0"/>
               <w:jc w:val="left"/>
               <w:rPr>
+                <w:rFonts w:hint="default" w:ascii="Times New Roman" w:hAnsi="Times New Roman" w:cs="Times New Roman"/>
                 <w:b w:val="0"/>
                 <w:bCs w:val="0"/>
               </w:rPr>
             </w:pPr>
             <w:r>
               <w:rPr>
+                <w:rFonts w:hint="default" w:ascii="Times New Roman" w:hAnsi="Times New Roman" w:cs="Times New Roman"/>
                 <w:b w:val="0"/>
                 <w:bCs w:val="0"/>
               </w:rPr>
@@ -2962,7 +3067,7 @@
           </w:p>
           <w:p>
             <w:pPr>
-              <w:pStyle w:val="18"/>
+              <w:pStyle w:val="19"/>
               <w:keepNext w:val="0"/>
               <w:keepLines w:val="0"/>
               <w:widowControl/>
@@ -2985,6 +3090,7 @@
             </w:pPr>
             <w:r>
               <w:rPr>
+                <w:rFonts w:hint="default" w:ascii="Times New Roman" w:hAnsi="Times New Roman" w:cs="Times New Roman"/>
                 <w:b w:val="0"/>
                 <w:bCs w:val="0"/>
               </w:rPr>
@@ -3084,7 +3190,7 @@
           </w:tcPr>
           <w:p>
             <w:pPr>
-              <w:pStyle w:val="18"/>
+              <w:pStyle w:val="19"/>
               <w:keepNext w:val="0"/>
               <w:keepLines w:val="0"/>
               <w:widowControl/>
@@ -3096,12 +3202,14 @@
               <w:ind w:left="420" w:leftChars="0" w:hanging="420" w:firstLineChars="0"/>
               <w:jc w:val="left"/>
               <w:rPr>
+                <w:rFonts w:hint="default" w:ascii="Times New Roman" w:hAnsi="Times New Roman" w:cs="Times New Roman"/>
                 <w:b w:val="0"/>
                 <w:bCs w:val="0"/>
               </w:rPr>
             </w:pPr>
             <w:r>
               <w:rPr>
+                <w:rFonts w:hint="default" w:ascii="Times New Roman" w:hAnsi="Times New Roman" w:cs="Times New Roman"/>
                 <w:b w:val="0"/>
                 <w:bCs w:val="0"/>
               </w:rPr>
@@ -3110,7 +3218,7 @@
           </w:p>
           <w:p>
             <w:pPr>
-              <w:pStyle w:val="18"/>
+              <w:pStyle w:val="19"/>
               <w:keepNext w:val="0"/>
               <w:keepLines w:val="0"/>
               <w:widowControl/>
@@ -3122,12 +3230,14 @@
               <w:ind w:left="420" w:leftChars="0" w:hanging="420" w:firstLineChars="0"/>
               <w:jc w:val="left"/>
               <w:rPr>
+                <w:rFonts w:hint="default" w:ascii="Times New Roman" w:hAnsi="Times New Roman" w:cs="Times New Roman"/>
                 <w:b w:val="0"/>
                 <w:bCs w:val="0"/>
               </w:rPr>
             </w:pPr>
             <w:r>
               <w:rPr>
+                <w:rFonts w:hint="default" w:ascii="Times New Roman" w:hAnsi="Times New Roman" w:cs="Times New Roman"/>
                 <w:b w:val="0"/>
                 <w:bCs w:val="0"/>
               </w:rPr>
@@ -3136,7 +3246,7 @@
           </w:p>
           <w:p>
             <w:pPr>
-              <w:pStyle w:val="18"/>
+              <w:pStyle w:val="19"/>
               <w:keepNext w:val="0"/>
               <w:keepLines w:val="0"/>
               <w:widowControl/>
@@ -3159,6 +3269,7 @@
             </w:pPr>
             <w:r>
               <w:rPr>
+                <w:rFonts w:hint="default" w:ascii="Times New Roman" w:hAnsi="Times New Roman" w:cs="Times New Roman"/>
                 <w:b w:val="0"/>
                 <w:bCs w:val="0"/>
               </w:rPr>
@@ -3256,7 +3367,7 @@
           </w:tcPr>
           <w:p>
             <w:pPr>
-              <w:pStyle w:val="18"/>
+              <w:pStyle w:val="19"/>
               <w:keepNext w:val="0"/>
               <w:keepLines w:val="0"/>
               <w:widowControl/>
@@ -3268,12 +3379,14 @@
               <w:ind w:left="420" w:leftChars="0" w:hanging="420" w:firstLineChars="0"/>
               <w:jc w:val="left"/>
               <w:rPr>
+                <w:rFonts w:hint="default" w:ascii="Times New Roman" w:hAnsi="Times New Roman" w:cs="Times New Roman"/>
                 <w:b w:val="0"/>
                 <w:bCs w:val="0"/>
               </w:rPr>
             </w:pPr>
             <w:r>
               <w:rPr>
+                <w:rFonts w:hint="default" w:ascii="Times New Roman" w:hAnsi="Times New Roman" w:cs="Times New Roman"/>
                 <w:b w:val="0"/>
                 <w:bCs w:val="0"/>
               </w:rPr>
@@ -3282,7 +3395,7 @@
           </w:p>
           <w:p>
             <w:pPr>
-              <w:pStyle w:val="18"/>
+              <w:pStyle w:val="19"/>
               <w:keepNext w:val="0"/>
               <w:keepLines w:val="0"/>
               <w:widowControl/>
@@ -3305,6 +3418,7 @@
             </w:pPr>
             <w:r>
               <w:rPr>
+                <w:rFonts w:hint="default" w:ascii="Times New Roman" w:hAnsi="Times New Roman" w:cs="Times New Roman"/>
                 <w:b w:val="0"/>
                 <w:bCs w:val="0"/>
               </w:rPr>
@@ -3313,7 +3427,7 @@
           </w:p>
           <w:p>
             <w:pPr>
-              <w:pStyle w:val="18"/>
+              <w:pStyle w:val="19"/>
               <w:keepNext w:val="0"/>
               <w:keepLines w:val="0"/>
               <w:widowControl/>
@@ -3336,7 +3450,7 @@
             </w:pPr>
             <w:r>
               <w:rPr>
-                <w:rFonts w:hint="default"/>
+                <w:rFonts w:hint="default" w:ascii="Times New Roman" w:hAnsi="Times New Roman" w:cs="Times New Roman"/>
                 <w:b w:val="0"/>
                 <w:bCs w:val="0"/>
                 <w:lang w:val="en-US"/>
@@ -3404,7 +3518,7 @@
     </w:p>
     <w:p>
       <w:pPr>
-        <w:pStyle w:val="18"/>
+        <w:pStyle w:val="19"/>
         <w:keepNext w:val="0"/>
         <w:keepLines w:val="0"/>
         <w:widowControl/>
@@ -3419,12 +3533,14 @@
         <w:ind w:left="880" w:leftChars="0" w:hanging="420" w:firstLineChars="0"/>
         <w:jc w:val="both"/>
         <w:rPr>
-          <w:b w:val="0"/>
-          <w:bCs w:val="0"/>
-        </w:rPr>
-      </w:pPr>
-      <w:r>
-        <w:rPr>
+          <w:rFonts w:hint="default" w:ascii="Times New Roman" w:hAnsi="Times New Roman" w:cs="Times New Roman"/>
+          <w:b w:val="0"/>
+          <w:bCs w:val="0"/>
+        </w:rPr>
+      </w:pPr>
+      <w:r>
+        <w:rPr>
+          <w:rFonts w:hint="default" w:ascii="Times New Roman" w:hAnsi="Times New Roman" w:cs="Times New Roman"/>
           <w:b w:val="0"/>
           <w:bCs w:val="0"/>
         </w:rPr>
@@ -3432,7 +3548,7 @@
       </w:r>
       <w:r>
         <w:rPr>
-          <w:rFonts w:hint="default"/>
+          <w:rFonts w:hint="default" w:ascii="Times New Roman" w:hAnsi="Times New Roman" w:cs="Times New Roman"/>
           <w:b w:val="0"/>
           <w:bCs w:val="0"/>
           <w:lang w:val="en-US"/>
@@ -3441,6 +3557,7 @@
       </w:r>
       <w:r>
         <w:rPr>
+          <w:rFonts w:hint="default" w:ascii="Times New Roman" w:hAnsi="Times New Roman" w:cs="Times New Roman"/>
           <w:b w:val="0"/>
           <w:bCs w:val="0"/>
         </w:rPr>
@@ -3448,7 +3565,7 @@
       </w:r>
       <w:r>
         <w:rPr>
-          <w:rFonts w:hint="default"/>
+          <w:rFonts w:hint="default" w:ascii="Times New Roman" w:hAnsi="Times New Roman" w:cs="Times New Roman"/>
           <w:b w:val="0"/>
           <w:bCs w:val="0"/>
           <w:lang w:val="en-US"/>
@@ -3457,6 +3574,7 @@
       </w:r>
       <w:r>
         <w:rPr>
+          <w:rFonts w:hint="default" w:ascii="Times New Roman" w:hAnsi="Times New Roman" w:cs="Times New Roman"/>
           <w:b w:val="0"/>
           <w:bCs w:val="0"/>
         </w:rPr>
@@ -3465,7 +3583,7 @@
     </w:p>
     <w:p>
       <w:pPr>
-        <w:pStyle w:val="18"/>
+        <w:pStyle w:val="19"/>
         <w:keepNext w:val="0"/>
         <w:keepLines w:val="0"/>
         <w:widowControl/>
@@ -3480,12 +3598,14 @@
         <w:ind w:left="880" w:leftChars="0" w:hanging="420" w:firstLineChars="0"/>
         <w:jc w:val="both"/>
         <w:rPr>
-          <w:b w:val="0"/>
-          <w:bCs w:val="0"/>
-        </w:rPr>
-      </w:pPr>
-      <w:r>
-        <w:rPr>
+          <w:rFonts w:hint="default" w:ascii="Times New Roman" w:hAnsi="Times New Roman" w:cs="Times New Roman"/>
+          <w:b w:val="0"/>
+          <w:bCs w:val="0"/>
+        </w:rPr>
+      </w:pPr>
+      <w:r>
+        <w:rPr>
+          <w:rFonts w:hint="default" w:ascii="Times New Roman" w:hAnsi="Times New Roman" w:cs="Times New Roman"/>
           <w:b w:val="0"/>
           <w:bCs w:val="0"/>
         </w:rPr>
@@ -3493,7 +3613,7 @@
       </w:r>
       <w:r>
         <w:rPr>
-          <w:rFonts w:hint="default"/>
+          <w:rFonts w:hint="default" w:ascii="Times New Roman" w:hAnsi="Times New Roman" w:cs="Times New Roman"/>
           <w:b w:val="0"/>
           <w:bCs w:val="0"/>
           <w:lang w:val="en-US"/>
@@ -3502,6 +3622,7 @@
       </w:r>
       <w:r>
         <w:rPr>
+          <w:rFonts w:hint="default" w:ascii="Times New Roman" w:hAnsi="Times New Roman" w:cs="Times New Roman"/>
           <w:b w:val="0"/>
           <w:bCs w:val="0"/>
         </w:rPr>
@@ -3510,7 +3631,7 @@
     </w:p>
     <w:p>
       <w:pPr>
-        <w:pStyle w:val="18"/>
+        <w:pStyle w:val="19"/>
         <w:keepNext w:val="0"/>
         <w:keepLines w:val="0"/>
         <w:widowControl/>
@@ -3525,12 +3646,14 @@
         <w:ind w:left="880" w:leftChars="0" w:hanging="420" w:firstLineChars="0"/>
         <w:jc w:val="both"/>
         <w:rPr>
-          <w:b w:val="0"/>
-          <w:bCs w:val="0"/>
-        </w:rPr>
-      </w:pPr>
-      <w:r>
-        <w:rPr>
+          <w:rFonts w:hint="default" w:ascii="Times New Roman" w:hAnsi="Times New Roman" w:cs="Times New Roman"/>
+          <w:b w:val="0"/>
+          <w:bCs w:val="0"/>
+        </w:rPr>
+      </w:pPr>
+      <w:r>
+        <w:rPr>
+          <w:rFonts w:hint="default" w:ascii="Times New Roman" w:hAnsi="Times New Roman" w:cs="Times New Roman"/>
           <w:b w:val="0"/>
           <w:bCs w:val="0"/>
         </w:rPr>
@@ -3539,7 +3662,7 @@
     </w:p>
     <w:p>
       <w:pPr>
-        <w:pStyle w:val="18"/>
+        <w:pStyle w:val="19"/>
         <w:keepNext w:val="0"/>
         <w:keepLines w:val="0"/>
         <w:widowControl/>
@@ -3554,12 +3677,14 @@
         <w:ind w:left="880" w:leftChars="0" w:hanging="420" w:firstLineChars="0"/>
         <w:jc w:val="both"/>
         <w:rPr>
-          <w:b w:val="0"/>
-          <w:bCs w:val="0"/>
-        </w:rPr>
-      </w:pPr>
-      <w:r>
-        <w:rPr>
+          <w:rFonts w:hint="default" w:ascii="Times New Roman" w:hAnsi="Times New Roman" w:cs="Times New Roman"/>
+          <w:b w:val="0"/>
+          <w:bCs w:val="0"/>
+        </w:rPr>
+      </w:pPr>
+      <w:r>
+        <w:rPr>
+          <w:rFonts w:hint="default" w:ascii="Times New Roman" w:hAnsi="Times New Roman" w:cs="Times New Roman"/>
           <w:b w:val="0"/>
           <w:bCs w:val="0"/>
         </w:rPr>
@@ -3568,7 +3693,7 @@
     </w:p>
     <w:p>
       <w:pPr>
-        <w:pStyle w:val="18"/>
+        <w:pStyle w:val="19"/>
         <w:keepNext w:val="0"/>
         <w:keepLines w:val="0"/>
         <w:widowControl/>
@@ -3591,6 +3716,7 @@
       </w:pPr>
       <w:r>
         <w:rPr>
+          <w:rFonts w:hint="default" w:ascii="Times New Roman" w:hAnsi="Times New Roman" w:cs="Times New Roman"/>
           <w:b w:val="0"/>
           <w:bCs w:val="0"/>
         </w:rPr>
@@ -3598,7 +3724,7 @@
       </w:r>
       <w:r>
         <w:rPr>
-          <w:rFonts w:hint="default"/>
+          <w:rFonts w:hint="default" w:ascii="Times New Roman" w:hAnsi="Times New Roman" w:cs="Times New Roman"/>
           <w:b w:val="0"/>
           <w:bCs w:val="0"/>
           <w:lang w:val="en-US"/>
@@ -3607,6 +3733,7 @@
       </w:r>
       <w:r>
         <w:rPr>
+          <w:rFonts w:hint="default" w:ascii="Times New Roman" w:hAnsi="Times New Roman" w:cs="Times New Roman"/>
           <w:b w:val="0"/>
           <w:bCs w:val="0"/>
         </w:rPr>
@@ -3615,7 +3742,7 @@
     </w:p>
     <w:p>
       <w:pPr>
-        <w:pStyle w:val="18"/>
+        <w:pStyle w:val="19"/>
         <w:keepNext w:val="0"/>
         <w:keepLines w:val="0"/>
         <w:widowControl/>
@@ -3662,29 +3789,1404 @@
       </w:r>
       <w:r>
         <w:rPr>
+          <w:rFonts w:hint="default" w:ascii="Times New Roman" w:hAnsi="Times New Roman" w:cs="Times New Roman"/>
+          <w:lang w:val="en-US"/>
+        </w:rPr>
+        <w:t>B</w:t>
+      </w:r>
+      <w:r>
+        <w:rPr>
+          <w:rFonts w:hint="default" w:ascii="Times New Roman" w:hAnsi="Times New Roman" w:cs="Times New Roman"/>
+          <w:lang w:val="en-US"/>
+        </w:rPr>
+        <w:t xml:space="preserve">: </w:t>
+      </w:r>
+      <w:r>
+        <w:rPr>
+          <w:rFonts w:hint="default" w:ascii="Times New Roman" w:hAnsi="Times New Roman" w:cs="Times New Roman"/>
+          <w:lang w:val="en-US"/>
+        </w:rPr>
+        <w:t>Exploratory Data Analysis (EDA)</w:t>
+      </w:r>
+    </w:p>
+    <w:p>
+      <w:pPr>
+        <w:pStyle w:val="3"/>
+        <w:numPr>
+          <w:numId w:val="0"/>
+        </w:numPr>
+        <w:bidi w:val="0"/>
+        <w:ind w:leftChars="0"/>
+        <w:rPr>
+          <w:rFonts w:hint="default" w:ascii="Times New Roman" w:hAnsi="Times New Roman" w:cs="Times New Roman"/>
+          <w:lang w:val="en-US"/>
+        </w:rPr>
+      </w:pPr>
+      <w:r>
+        <w:rPr>
+          <w:rFonts w:hint="default" w:ascii="Times New Roman" w:hAnsi="Times New Roman" w:cs="Times New Roman"/>
+          <w:lang w:val="en-US"/>
+        </w:rPr>
+        <w:t>2.1 Dataset Overview</w:t>
+      </w:r>
+    </w:p>
+    <w:p>
+      <w:pPr>
+        <w:pStyle w:val="4"/>
+        <w:bidi w:val="0"/>
+        <w:ind w:left="440" w:leftChars="200" w:firstLine="0" w:firstLineChars="0"/>
+        <w:rPr>
+          <w:rFonts w:hint="default" w:ascii="Times New Roman" w:hAnsi="Times New Roman" w:cs="Times New Roman"/>
+          <w:lang w:val="en-US"/>
+        </w:rPr>
+      </w:pPr>
+      <w:r>
+        <w:rPr>
+          <w:rFonts w:hint="default" w:ascii="Times New Roman" w:hAnsi="Times New Roman" w:cs="Times New Roman"/>
+          <w:lang w:val="en-US"/>
+        </w:rPr>
+        <w:t>2.1.1 Glossary of Symbsols</w:t>
+      </w:r>
+    </w:p>
+    <w:p>
+      <w:pPr>
+        <w:ind w:left="440" w:leftChars="200" w:firstLine="0" w:firstLineChars="0"/>
+        <w:jc w:val="both"/>
+        <w:rPr>
+          <w:rFonts w:hint="default" w:ascii="Times New Roman" w:hAnsi="Times New Roman" w:eastAsia="SimSun" w:cs="Times New Roman"/>
+          <w:b w:val="0"/>
+          <w:bCs w:val="0"/>
+          <w:sz w:val="25"/>
+          <w:szCs w:val="25"/>
+        </w:rPr>
+      </w:pPr>
+      <w:r>
+        <w:rPr>
+          <w:rFonts w:hint="default" w:ascii="Times New Roman" w:hAnsi="Times New Roman" w:eastAsia="SimSun" w:cs="Times New Roman"/>
+          <w:b w:val="0"/>
+          <w:bCs w:val="0"/>
+          <w:sz w:val="25"/>
+          <w:szCs w:val="25"/>
+        </w:rPr>
+        <w:t xml:space="preserve">First and foremost, our team received a dataset which contains various abbreviations under the Location or Type attributes. Moreover, our team decided to use the file </w:t>
+      </w:r>
+      <w:r>
+        <w:rPr>
+          <w:rFonts w:hint="default" w:ascii="Times New Roman" w:hAnsi="Times New Roman" w:eastAsia="SimSun" w:cs="Times New Roman"/>
+          <w:b/>
+          <w:bCs/>
+          <w:i/>
+          <w:iCs/>
+          <w:sz w:val="25"/>
+          <w:szCs w:val="25"/>
+        </w:rPr>
+        <w:t xml:space="preserve">Symbols.csv </w:t>
+      </w:r>
+      <w:r>
+        <w:rPr>
+          <w:rFonts w:hint="default" w:ascii="Times New Roman" w:hAnsi="Times New Roman" w:eastAsia="SimSun" w:cs="Times New Roman"/>
+          <w:b w:val="0"/>
+          <w:bCs w:val="0"/>
+          <w:sz w:val="25"/>
+          <w:szCs w:val="25"/>
+        </w:rPr>
+        <w:t>as a reference data dictionary. Specifically, the following figures indicate how our team processed and saved these unique symbols using Python, ensuring that every professional traffic term is correctly mapped for the analysis phase</w:t>
+      </w:r>
+    </w:p>
+    <w:p>
+      <w:pPr>
+        <w:ind w:left="440" w:leftChars="200" w:firstLine="0" w:firstLineChars="0"/>
+        <w:jc w:val="both"/>
+        <w:rPr>
+          <w:rFonts w:hint="default" w:ascii="Times New Roman" w:hAnsi="Times New Roman" w:eastAsia="SimSun" w:cs="Times New Roman"/>
+          <w:b w:val="0"/>
+          <w:bCs w:val="0"/>
+          <w:sz w:val="25"/>
+          <w:szCs w:val="25"/>
+          <w:lang w:val="en-US"/>
+        </w:rPr>
+      </w:pPr>
+    </w:p>
+    <w:p>
+      <w:pPr>
+        <w:ind w:left="440" w:leftChars="200" w:firstLine="0" w:firstLineChars="0"/>
+        <w:jc w:val="both"/>
+        <w:rPr>
+          <w:rFonts w:hint="default" w:ascii="Times New Roman" w:hAnsi="Times New Roman" w:eastAsia="SimSun" w:cs="Times New Roman"/>
+          <w:b w:val="0"/>
+          <w:bCs w:val="0"/>
+          <w:sz w:val="25"/>
+          <w:szCs w:val="25"/>
+          <w:lang w:val="en-US"/>
+        </w:rPr>
+      </w:pPr>
+    </w:p>
+    <w:p>
+      <w:pPr>
+        <w:ind w:left="440" w:leftChars="200" w:firstLine="0" w:firstLineChars="0"/>
+        <w:jc w:val="both"/>
+        <w:rPr>
+          <w:rFonts w:hint="default" w:ascii="Times New Roman" w:hAnsi="Times New Roman" w:eastAsia="SimSun" w:cs="Times New Roman"/>
+          <w:b w:val="0"/>
+          <w:bCs w:val="0"/>
+          <w:sz w:val="25"/>
+          <w:szCs w:val="25"/>
+          <w:lang w:val="en-US"/>
+        </w:rPr>
+      </w:pPr>
+    </w:p>
+    <w:p>
+      <w:pPr>
+        <w:ind w:left="440" w:leftChars="200" w:firstLine="0" w:firstLineChars="0"/>
+        <w:jc w:val="both"/>
+        <w:rPr>
+          <w:rFonts w:hint="default" w:ascii="Times New Roman" w:hAnsi="Times New Roman" w:eastAsia="SimSun" w:cs="Times New Roman"/>
+          <w:b w:val="0"/>
+          <w:bCs w:val="0"/>
+          <w:sz w:val="25"/>
+          <w:szCs w:val="25"/>
+          <w:lang w:val="en-US"/>
+        </w:rPr>
+      </w:pPr>
+    </w:p>
+    <w:p>
+      <w:pPr>
+        <w:ind w:left="440" w:leftChars="200" w:firstLine="0" w:firstLineChars="0"/>
+        <w:jc w:val="both"/>
+        <w:rPr>
+          <w:rFonts w:hint="default" w:ascii="Times New Roman" w:hAnsi="Times New Roman" w:eastAsia="SimSun" w:cs="Times New Roman"/>
+          <w:b w:val="0"/>
+          <w:bCs w:val="0"/>
+          <w:sz w:val="25"/>
+          <w:szCs w:val="25"/>
+          <w:lang w:val="en-US"/>
+        </w:rPr>
+      </w:pPr>
+    </w:p>
+    <w:p>
+      <w:pPr>
+        <w:ind w:left="440" w:leftChars="200" w:firstLine="0" w:firstLineChars="0"/>
+        <w:jc w:val="both"/>
+        <w:rPr>
+          <w:rFonts w:hint="default" w:ascii="Times New Roman" w:hAnsi="Times New Roman" w:eastAsia="SimSun" w:cs="Times New Roman"/>
+          <w:b w:val="0"/>
+          <w:bCs w:val="0"/>
+          <w:sz w:val="25"/>
+          <w:szCs w:val="25"/>
+          <w:lang w:val="en-US"/>
+        </w:rPr>
+      </w:pPr>
+    </w:p>
+    <w:p>
+      <w:pPr>
+        <w:ind w:left="440" w:leftChars="200" w:firstLine="0" w:firstLineChars="0"/>
+        <w:jc w:val="both"/>
+        <w:rPr>
+          <w:rFonts w:hint="default" w:ascii="Times New Roman" w:hAnsi="Times New Roman" w:eastAsia="SimSun" w:cs="Times New Roman"/>
+          <w:b w:val="0"/>
+          <w:bCs w:val="0"/>
+          <w:sz w:val="25"/>
+          <w:szCs w:val="25"/>
+          <w:lang w:val="en-US"/>
+        </w:rPr>
+      </w:pPr>
+      <w:r>
+        <w:rPr>
+          <w:rFonts w:hint="default" w:ascii="Times New Roman" w:hAnsi="Times New Roman" w:cs="Times New Roman"/>
+          <w:sz w:val="25"/>
+        </w:rPr>
+        <mc:AlternateContent>
+          <mc:Choice Requires="wps">
+            <w:drawing>
+              <wp:anchor distT="0" distB="0" distL="114300" distR="114300" simplePos="0" relativeHeight="251662336" behindDoc="0" locked="0" layoutInCell="1" allowOverlap="1">
+                <wp:simplePos x="0" y="0"/>
+                <wp:positionH relativeFrom="column">
+                  <wp:posOffset>2029460</wp:posOffset>
+                </wp:positionH>
+                <wp:positionV relativeFrom="paragraph">
+                  <wp:posOffset>38100</wp:posOffset>
+                </wp:positionV>
+                <wp:extent cx="3373755" cy="448310"/>
+                <wp:effectExtent l="0" t="0" r="9525" b="8890"/>
+                <wp:wrapNone/>
+                <wp:docPr id="6" name="Text Box 6"/>
+                <wp:cNvGraphicFramePr/>
+                <a:graphic xmlns:a="http://schemas.openxmlformats.org/drawingml/2006/main">
+                  <a:graphicData uri="http://schemas.microsoft.com/office/word/2010/wordprocessingShape">
+                    <wps:wsp>
+                      <wps:cNvSpPr txBox="1"/>
+                      <wps:spPr>
+                        <a:xfrm>
+                          <a:off x="0" y="0"/>
+                          <a:ext cx="3373755" cy="448310"/>
+                        </a:xfrm>
+                        <a:prstGeom prst="rect">
+                          <a:avLst/>
+                        </a:prstGeom>
+                        <a:solidFill>
+                          <a:schemeClr val="lt1"/>
+                        </a:solidFill>
+                        <a:ln w="6350">
+                          <a:noFill/>
+                        </a:ln>
+                      </wps:spPr>
+                      <wps:style>
+                        <a:lnRef idx="0">
+                          <a:schemeClr val="accent1"/>
+                        </a:lnRef>
+                        <a:fillRef idx="0">
+                          <a:schemeClr val="accent1"/>
+                        </a:fillRef>
+                        <a:effectRef idx="0">
+                          <a:schemeClr val="accent1"/>
+                        </a:effectRef>
+                        <a:fontRef idx="minor">
+                          <a:schemeClr val="dk1"/>
+                        </a:fontRef>
+                      </wps:style>
+                      <wps:txbx>
+                        <w:txbxContent>
+                          <w:p>
+                            <w:pPr>
+                              <w:jc w:val="both"/>
+                              <w:rPr>
+                                <w:rFonts w:hint="default" w:ascii="Times New Roman" w:hAnsi="Times New Roman" w:cs="Times New Roman"/>
+                                <w:b/>
+                                <w:bCs/>
+                                <w:i/>
+                                <w:iCs/>
+                                <w:sz w:val="21"/>
+                                <w:szCs w:val="21"/>
+                                <w:lang w:val="en-US"/>
+                              </w:rPr>
+                            </w:pPr>
+                            <w:r>
+                              <w:rPr>
+                                <w:rFonts w:hint="default" w:ascii="Times New Roman" w:hAnsi="Times New Roman" w:cs="Times New Roman"/>
+                                <w:b/>
+                                <w:bCs/>
+                                <w:i/>
+                                <w:iCs/>
+                                <w:sz w:val="21"/>
+                                <w:szCs w:val="21"/>
+                                <w:lang w:val="en-US"/>
+                              </w:rPr>
+                              <w:t xml:space="preserve">Figure 2: </w:t>
+                            </w:r>
+                            <w:r>
+                              <w:rPr>
+                                <w:rFonts w:hint="default" w:ascii="Times New Roman" w:hAnsi="Times New Roman" w:eastAsia="SimSun" w:cs="Times New Roman"/>
+                                <w:b/>
+                                <w:bCs/>
+                                <w:i/>
+                                <w:iCs/>
+                                <w:sz w:val="21"/>
+                                <w:szCs w:val="21"/>
+                              </w:rPr>
+                              <w:t>Loading and preprocessing the symbol dictionary to handle special characters.</w:t>
+                            </w:r>
+                          </w:p>
+                        </w:txbxContent>
+                      </wps:txbx>
+                      <wps:bodyPr rot="0" spcFirstLastPara="0" vertOverflow="overflow" horzOverflow="overflow" vert="horz" wrap="square" lIns="91440" tIns="45720" rIns="91440" bIns="45720" numCol="1" spcCol="0" rtlCol="0" fromWordArt="0" anchor="t" anchorCtr="0" forceAA="0" compatLnSpc="1">
+                        <a:noAutofit/>
+                      </wps:bodyPr>
+                    </wps:wsp>
+                  </a:graphicData>
+                </a:graphic>
+              </wp:anchor>
+            </w:drawing>
+          </mc:Choice>
+          <mc:Fallback>
+            <w:pict>
+              <v:shape id="_x0000_s1026" o:spid="_x0000_s1026" o:spt="202" type="#_x0000_t202" style="position:absolute;left:0pt;margin-left:159.8pt;margin-top:3pt;height:35.3pt;width:265.65pt;z-index:251662336;mso-width-relative:page;mso-height-relative:page;" fillcolor="#FFFFFF [3201]" filled="t" stroked="f" coordsize="21600,21600" o:gfxdata="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">
+                <v:fill on="t" focussize="0,0"/>
+                <v:stroke on="f" weight="0.5pt"/>
+                <v:imagedata o:title=""/>
+                <o:lock v:ext="edit" aspectratio="f"/>
+                <v:textbox>
+                  <w:txbxContent>
+                    <w:p>
+                      <w:pPr>
+                        <w:jc w:val="both"/>
+                        <w:rPr>
+                          <w:rFonts w:hint="default" w:ascii="Times New Roman" w:hAnsi="Times New Roman" w:cs="Times New Roman"/>
+                          <w:b/>
+                          <w:bCs/>
+                          <w:i/>
+                          <w:iCs/>
+                          <w:sz w:val="21"/>
+                          <w:szCs w:val="21"/>
+                          <w:lang w:val="en-US"/>
+                        </w:rPr>
+                      </w:pPr>
+                      <w:r>
+                        <w:rPr>
+                          <w:rFonts w:hint="default" w:ascii="Times New Roman" w:hAnsi="Times New Roman" w:cs="Times New Roman"/>
+                          <w:b/>
+                          <w:bCs/>
+                          <w:i/>
+                          <w:iCs/>
+                          <w:sz w:val="21"/>
+                          <w:szCs w:val="21"/>
+                          <w:lang w:val="en-US"/>
+                        </w:rPr>
+                        <w:t xml:space="preserve">Figure 2: </w:t>
+                      </w:r>
+                      <w:r>
+                        <w:rPr>
+                          <w:rFonts w:hint="default" w:ascii="Times New Roman" w:hAnsi="Times New Roman" w:eastAsia="SimSun" w:cs="Times New Roman"/>
+                          <w:b/>
+                          <w:bCs/>
+                          <w:i/>
+                          <w:iCs/>
+                          <w:sz w:val="21"/>
+                          <w:szCs w:val="21"/>
+                        </w:rPr>
+                        <w:t>Loading and preprocessing the symbol dictionary to handle special characters.</w:t>
+                      </w:r>
+                    </w:p>
+                  </w:txbxContent>
+                </v:textbox>
+              </v:shape>
+            </w:pict>
+          </mc:Fallback>
+        </mc:AlternateContent>
+      </w:r>
+      <w:r>
+        <w:rPr>
+          <w:rFonts w:hint="default" w:ascii="Times New Roman" w:hAnsi="Times New Roman" w:cs="Times New Roman"/>
+          <w:sz w:val="25"/>
+        </w:rPr>
+        <mc:AlternateContent>
+          <mc:Choice Requires="wps">
+            <w:drawing>
+              <wp:anchor distT="0" distB="0" distL="114300" distR="114300" simplePos="0" relativeHeight="251661312" behindDoc="0" locked="0" layoutInCell="1" allowOverlap="1">
+                <wp:simplePos x="0" y="0"/>
+                <wp:positionH relativeFrom="column">
+                  <wp:posOffset>-218440</wp:posOffset>
+                </wp:positionH>
+                <wp:positionV relativeFrom="paragraph">
+                  <wp:posOffset>15240</wp:posOffset>
+                </wp:positionV>
+                <wp:extent cx="2148205" cy="372745"/>
+                <wp:effectExtent l="0" t="0" r="635" b="8255"/>
+                <wp:wrapNone/>
+                <wp:docPr id="5" name="Text Box 5"/>
+                <wp:cNvGraphicFramePr/>
+                <a:graphic xmlns:a="http://schemas.openxmlformats.org/drawingml/2006/main">
+                  <a:graphicData uri="http://schemas.microsoft.com/office/word/2010/wordprocessingShape">
+                    <wps:wsp>
+                      <wps:cNvSpPr txBox="1"/>
+                      <wps:spPr>
+                        <a:xfrm>
+                          <a:off x="1113155" y="3629660"/>
+                          <a:ext cx="2148205" cy="372745"/>
+                        </a:xfrm>
+                        <a:prstGeom prst="rect">
+                          <a:avLst/>
+                        </a:prstGeom>
+                        <a:solidFill>
+                          <a:schemeClr val="lt1"/>
+                        </a:solidFill>
+                        <a:ln w="6350">
+                          <a:noFill/>
+                        </a:ln>
+                      </wps:spPr>
+                      <wps:style>
+                        <a:lnRef idx="0">
+                          <a:schemeClr val="accent1"/>
+                        </a:lnRef>
+                        <a:fillRef idx="0">
+                          <a:schemeClr val="accent1"/>
+                        </a:fillRef>
+                        <a:effectRef idx="0">
+                          <a:schemeClr val="accent1"/>
+                        </a:effectRef>
+                        <a:fontRef idx="minor">
+                          <a:schemeClr val="dk1"/>
+                        </a:fontRef>
+                      </wps:style>
+                      <wps:txbx>
+                        <w:txbxContent>
+                          <w:p>
+                            <w:pPr>
+                              <w:rPr>
+                                <w:rFonts w:hint="default" w:ascii="Times New Roman" w:hAnsi="Times New Roman" w:cs="Times New Roman"/>
+                                <w:b/>
+                                <w:bCs/>
+                                <w:i/>
+                                <w:iCs/>
+                                <w:sz w:val="21"/>
+                                <w:szCs w:val="21"/>
+                                <w:lang w:val="en-US"/>
+                              </w:rPr>
+                            </w:pPr>
+                            <w:r>
+                              <w:rPr>
+                                <w:rFonts w:hint="default" w:ascii="Times New Roman" w:hAnsi="Times New Roman" w:cs="Times New Roman"/>
+                                <w:b/>
+                                <w:bCs/>
+                                <w:i/>
+                                <w:iCs/>
+                                <w:sz w:val="21"/>
+                                <w:szCs w:val="21"/>
+                                <w:lang w:val="en-US"/>
+                              </w:rPr>
+                              <w:t>Figure 1: Data in file Symbols.csv</w:t>
+                            </w:r>
+                          </w:p>
+                        </w:txbxContent>
+                      </wps:txbx>
+                      <wps:bodyPr rot="0" spcFirstLastPara="0" vertOverflow="overflow" horzOverflow="overflow" vert="horz" wrap="square" lIns="91440" tIns="45720" rIns="91440" bIns="45720" numCol="1" spcCol="0" rtlCol="0" fromWordArt="0" anchor="t" anchorCtr="0" forceAA="0" compatLnSpc="1">
+                        <a:noAutofit/>
+                      </wps:bodyPr>
+                    </wps:wsp>
+                  </a:graphicData>
+                </a:graphic>
+              </wp:anchor>
+            </w:drawing>
+          </mc:Choice>
+          <mc:Fallback>
+            <w:pict>
+              <v:shape id="_x0000_s1026" o:spid="_x0000_s1026" o:spt="202" type="#_x0000_t202" style="position:absolute;left:0pt;margin-left:-17.2pt;margin-top:1.2pt;height:29.35pt;width:169.15pt;z-index:251661312;mso-width-relative:page;mso-height-relative:page;" fillcolor="#FFFFFF [3201]" filled="t" stroked="f" coordsize="21600,21600" o:gfxdata="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">
+                <v:fill on="t" focussize="0,0"/>
+                <v:stroke on="f" weight="0.5pt"/>
+                <v:imagedata o:title=""/>
+                <o:lock v:ext="edit" aspectratio="f"/>
+                <v:textbox>
+                  <w:txbxContent>
+                    <w:p>
+                      <w:pPr>
+                        <w:rPr>
+                          <w:rFonts w:hint="default" w:ascii="Times New Roman" w:hAnsi="Times New Roman" w:cs="Times New Roman"/>
+                          <w:b/>
+                          <w:bCs/>
+                          <w:i/>
+                          <w:iCs/>
+                          <w:sz w:val="21"/>
+                          <w:szCs w:val="21"/>
+                          <w:lang w:val="en-US"/>
+                        </w:rPr>
+                      </w:pPr>
+                      <w:r>
+                        <w:rPr>
+                          <w:rFonts w:hint="default" w:ascii="Times New Roman" w:hAnsi="Times New Roman" w:cs="Times New Roman"/>
+                          <w:b/>
+                          <w:bCs/>
+                          <w:i/>
+                          <w:iCs/>
+                          <w:sz w:val="21"/>
+                          <w:szCs w:val="21"/>
+                          <w:lang w:val="en-US"/>
+                        </w:rPr>
+                        <w:t>Figure 1: Data in file Symbols.csv</w:t>
+                      </w:r>
+                    </w:p>
+                  </w:txbxContent>
+                </v:textbox>
+              </v:shape>
+            </w:pict>
+          </mc:Fallback>
+        </mc:AlternateContent>
+      </w:r>
+      <w:r>
+        <w:rPr>
+          <w:rFonts w:hint="default" w:ascii="Times New Roman" w:hAnsi="Times New Roman" w:cs="Times New Roman"/>
+        </w:rPr>
+        <w:drawing>
+          <wp:anchor distT="0" distB="0" distL="114300" distR="114300" simplePos="0" relativeHeight="251659264" behindDoc="1" locked="0" layoutInCell="1" allowOverlap="1">
+            <wp:simplePos x="0" y="0"/>
+            <wp:positionH relativeFrom="column">
+              <wp:posOffset>1993265</wp:posOffset>
+            </wp:positionH>
+            <wp:positionV relativeFrom="paragraph">
+              <wp:posOffset>98425</wp:posOffset>
+            </wp:positionV>
+            <wp:extent cx="3506470" cy="2240280"/>
+            <wp:effectExtent l="0" t="0" r="13970" b="0"/>
+            <wp:wrapTight wrapText="bothSides">
+              <wp:wrapPolygon>
+                <wp:start x="0" y="0"/>
+                <wp:lineTo x="0" y="21453"/>
+                <wp:lineTo x="21498" y="21453"/>
+                <wp:lineTo x="21498" y="0"/>
+                <wp:lineTo x="0" y="0"/>
+              </wp:wrapPolygon>
+            </wp:wrapTight>
+            <wp:docPr id="3" name="Picture 3"/>
+            <wp:cNvGraphicFramePr>
+              <a:graphicFrameLocks xmlns:a="http://schemas.openxmlformats.org/drawingml/2006/main" noChangeAspect="1"/>
+            </wp:cNvGraphicFramePr>
+            <a:graphic xmlns:a="http://schemas.openxmlformats.org/drawingml/2006/main">
+              <a:graphicData uri="http://schemas.openxmlformats.org/drawingml/2006/picture">
+                <pic:pic xmlns:pic="http://schemas.openxmlformats.org/drawingml/2006/picture">
+                  <pic:nvPicPr>
+                    <pic:cNvPr id="3" name="Picture 3"/>
+                    <pic:cNvPicPr>
+                      <a:picLocks noChangeAspect="1"/>
+                    </pic:cNvPicPr>
+                  </pic:nvPicPr>
+                  <pic:blipFill>
+                    <a:blip r:embed="rId7"/>
+                    <a:stretch>
+                      <a:fillRect/>
+                    </a:stretch>
+                  </pic:blipFill>
+                  <pic:spPr>
+                    <a:xfrm>
+                      <a:off x="0" y="0"/>
+                      <a:ext cx="3506470" cy="2240280"/>
+                    </a:xfrm>
+                    <a:prstGeom prst="rect">
+                      <a:avLst/>
+                    </a:prstGeom>
+                    <a:noFill/>
+                    <a:ln>
+                      <a:noFill/>
+                    </a:ln>
+                  </pic:spPr>
+                </pic:pic>
+              </a:graphicData>
+            </a:graphic>
+          </wp:anchor>
+        </w:drawing>
+      </w:r>
+      <w:r>
+        <w:rPr>
+          <w:rFonts w:hint="default" w:ascii="Times New Roman" w:hAnsi="Times New Roman" w:cs="Times New Roman"/>
+        </w:rPr>
+        <w:drawing>
+          <wp:anchor distT="0" distB="0" distL="114300" distR="114300" simplePos="0" relativeHeight="251660288" behindDoc="0" locked="0" layoutInCell="1" allowOverlap="1">
+            <wp:simplePos x="0" y="0"/>
+            <wp:positionH relativeFrom="column">
+              <wp:posOffset>-106045</wp:posOffset>
+            </wp:positionH>
+            <wp:positionV relativeFrom="paragraph">
+              <wp:posOffset>147955</wp:posOffset>
+            </wp:positionV>
+            <wp:extent cx="1901825" cy="2169160"/>
+            <wp:effectExtent l="0" t="0" r="3175" b="10160"/>
+            <wp:wrapSquare wrapText="bothSides"/>
+            <wp:docPr id="4" name="Picture 4"/>
+            <wp:cNvGraphicFramePr>
+              <a:graphicFrameLocks xmlns:a="http://schemas.openxmlformats.org/drawingml/2006/main" noChangeAspect="1"/>
+            </wp:cNvGraphicFramePr>
+            <a:graphic xmlns:a="http://schemas.openxmlformats.org/drawingml/2006/main">
+              <a:graphicData uri="http://schemas.openxmlformats.org/drawingml/2006/picture">
+                <pic:pic xmlns:pic="http://schemas.openxmlformats.org/drawingml/2006/picture">
+                  <pic:nvPicPr>
+                    <pic:cNvPr id="4" name="Picture 4"/>
+                    <pic:cNvPicPr>
+                      <a:picLocks noChangeAspect="1"/>
+                    </pic:cNvPicPr>
+                  </pic:nvPicPr>
+                  <pic:blipFill>
+                    <a:blip r:embed="rId8"/>
+                    <a:stretch>
+                      <a:fillRect/>
+                    </a:stretch>
+                  </pic:blipFill>
+                  <pic:spPr>
+                    <a:xfrm>
+                      <a:off x="0" y="0"/>
+                      <a:ext cx="1901825" cy="2169160"/>
+                    </a:xfrm>
+                    <a:prstGeom prst="rect">
+                      <a:avLst/>
+                    </a:prstGeom>
+                    <a:noFill/>
+                    <a:ln>
+                      <a:noFill/>
+                    </a:ln>
+                  </pic:spPr>
+                </pic:pic>
+              </a:graphicData>
+            </a:graphic>
+          </wp:anchor>
+        </w:drawing>
+      </w:r>
+    </w:p>
+    <w:p>
+      <w:pPr>
+        <w:ind w:left="440" w:leftChars="200" w:firstLine="0" w:firstLineChars="0"/>
+        <w:jc w:val="both"/>
+        <w:rPr>
+          <w:rFonts w:hint="default" w:ascii="Times New Roman" w:hAnsi="Times New Roman" w:eastAsia="SimSun" w:cs="Times New Roman"/>
+          <w:b w:val="0"/>
+          <w:bCs w:val="0"/>
+          <w:sz w:val="25"/>
+          <w:szCs w:val="25"/>
+          <w:lang w:val="en-US"/>
+        </w:rPr>
+      </w:pPr>
+    </w:p>
+    <w:p>
+      <w:pPr>
+        <w:pStyle w:val="4"/>
+        <w:bidi w:val="0"/>
+        <w:ind w:left="440" w:leftChars="200" w:firstLine="0" w:firstLineChars="0"/>
+        <w:rPr>
+          <w:rFonts w:hint="default" w:ascii="Times New Roman" w:hAnsi="Times New Roman" w:cs="Times New Roman"/>
+          <w:lang w:val="en-US"/>
+        </w:rPr>
+      </w:pPr>
+      <w:r>
+        <w:rPr>
+          <w:rFonts w:hint="default" w:ascii="Times New Roman" w:hAnsi="Times New Roman" w:cs="Times New Roman"/>
+          <w:lang w:val="en-US"/>
+        </w:rPr>
+        <w:t>2.1.2 SCATS Site Classification</w:t>
+      </w:r>
+    </w:p>
+    <w:p>
+      <w:pPr>
+        <w:ind w:left="440" w:leftChars="200" w:firstLine="0" w:firstLineChars="0"/>
+        <w:jc w:val="both"/>
+        <w:rPr>
+          <w:rFonts w:hint="default" w:ascii="Times New Roman" w:hAnsi="Times New Roman" w:eastAsia="SimSun" w:cs="Times New Roman"/>
+          <w:b w:val="0"/>
+          <w:bCs w:val="0"/>
+          <w:sz w:val="25"/>
+          <w:szCs w:val="25"/>
+        </w:rPr>
+      </w:pPr>
+      <w:r>
+        <w:rPr>
+          <w:rFonts w:hint="default" w:ascii="Times New Roman" w:hAnsi="Times New Roman" w:eastAsia="SimSun" w:cs="Times New Roman"/>
+          <w:b w:val="0"/>
+          <w:bCs w:val="0"/>
+          <w:sz w:val="25"/>
+          <w:szCs w:val="25"/>
+        </w:rPr>
+        <w:t xml:space="preserve">Next, the assignment provided a valuable dataset named </w:t>
+      </w:r>
+      <w:r>
+        <w:rPr>
+          <w:rFonts w:hint="default" w:ascii="Times New Roman" w:hAnsi="Times New Roman" w:eastAsia="SimSun" w:cs="Times New Roman"/>
+          <w:b/>
+          <w:bCs/>
+          <w:i/>
+          <w:iCs/>
+          <w:sz w:val="25"/>
+          <w:szCs w:val="25"/>
+        </w:rPr>
+        <w:t>SCATSiteNumbers.csv</w:t>
+      </w:r>
+      <w:r>
+        <w:rPr>
+          <w:rFonts w:hint="default" w:ascii="Times New Roman" w:hAnsi="Times New Roman" w:eastAsia="SimSun" w:cs="Times New Roman"/>
+          <w:b/>
+          <w:bCs/>
+          <w:i/>
+          <w:iCs/>
+          <w:sz w:val="25"/>
+          <w:szCs w:val="25"/>
+          <w:lang w:val="en-US"/>
+        </w:rPr>
+        <w:t xml:space="preserve"> </w:t>
+      </w:r>
+      <w:bookmarkStart w:id="0" w:name="_GoBack"/>
+      <w:bookmarkEnd w:id="0"/>
+      <w:r>
+        <w:rPr>
+          <w:rFonts w:hint="default" w:ascii="Times New Roman" w:hAnsi="Times New Roman" w:eastAsia="SimSun" w:cs="Times New Roman"/>
+          <w:b w:val="0"/>
+          <w:bCs w:val="0"/>
+          <w:sz w:val="25"/>
+          <w:szCs w:val="25"/>
+        </w:rPr>
+        <w:t>which functions as a comprehensive directory. Specifically, this dataset contains over 1,000 unique entries mapping Site Numbers to their respective physical locations. The key characteristics of this dataset include:</w:t>
+      </w:r>
+    </w:p>
+    <w:p>
+      <w:pPr>
+        <w:pStyle w:val="19"/>
+        <w:keepNext w:val="0"/>
+        <w:keepLines w:val="0"/>
+        <w:widowControl/>
+        <w:numPr>
+          <w:ilvl w:val="0"/>
+          <w:numId w:val="4"/>
+        </w:numPr>
+        <w:suppressLineNumbers w:val="0"/>
+        <w:tabs>
+          <w:tab w:val="clear" w:pos="420"/>
+        </w:tabs>
+        <w:ind w:left="1320" w:leftChars="0" w:hanging="420" w:firstLineChars="0"/>
+        <w:jc w:val="both"/>
+        <w:rPr>
+          <w:b w:val="0"/>
+          <w:bCs w:val="0"/>
+        </w:rPr>
+      </w:pPr>
+      <w:r>
+        <w:rPr>
+          <w:b w:val="0"/>
+          <w:bCs w:val="0"/>
+        </w:rPr>
+        <w:t>Granularity: Detailed street-level descriptions</w:t>
+      </w:r>
+      <w:r>
+        <w:rPr>
+          <w:rFonts w:hint="default"/>
+          <w:b w:val="0"/>
+          <w:bCs w:val="0"/>
+          <w:lang w:val="en-US"/>
+        </w:rPr>
+        <w:t xml:space="preserve"> </w:t>
+      </w:r>
+      <w:r>
+        <w:rPr>
+          <w:b w:val="0"/>
+          <w:bCs w:val="0"/>
+        </w:rPr>
+        <w:t>such as the intersection of</w:t>
+      </w:r>
+      <w:r>
+        <w:rPr>
+          <w:rFonts w:hint="default"/>
+          <w:b w:val="0"/>
+          <w:bCs w:val="0"/>
+          <w:lang w:val="en-US"/>
+        </w:rPr>
+        <w:t xml:space="preserve"> </w:t>
+      </w:r>
+      <w:r>
+        <w:rPr>
+          <w:b w:val="0"/>
+          <w:bCs w:val="0"/>
+        </w:rPr>
+        <w:t>ABBOTTS/CLELANDS, providing high-resolution spatial data.</w:t>
+      </w:r>
+    </w:p>
+    <w:p>
+      <w:pPr>
+        <w:pStyle w:val="19"/>
+        <w:keepNext w:val="0"/>
+        <w:keepLines w:val="0"/>
+        <w:widowControl/>
+        <w:numPr>
+          <w:ilvl w:val="0"/>
+          <w:numId w:val="4"/>
+        </w:numPr>
+        <w:suppressLineNumbers w:val="0"/>
+        <w:tabs>
+          <w:tab w:val="clear" w:pos="420"/>
+        </w:tabs>
+        <w:ind w:left="1320" w:leftChars="0" w:hanging="420" w:firstLineChars="0"/>
+        <w:jc w:val="both"/>
+        <w:rPr>
+          <w:b w:val="0"/>
+          <w:bCs w:val="0"/>
+        </w:rPr>
+      </w:pPr>
+      <w:r>
+        <w:rPr>
+          <w:b w:val="0"/>
+          <w:bCs w:val="0"/>
+        </w:rPr>
+        <w:t>Categorization: Sites are classified into functional types including INT (Intersections) and POS (Pedestrian signals).</w:t>
+      </w:r>
+    </w:p>
+    <w:p>
+      <w:pPr>
+        <w:pStyle w:val="19"/>
+        <w:keepNext w:val="0"/>
+        <w:keepLines w:val="0"/>
+        <w:widowControl/>
+        <w:numPr>
+          <w:ilvl w:val="0"/>
+          <w:numId w:val="4"/>
+        </w:numPr>
+        <w:suppressLineNumbers w:val="0"/>
+        <w:tabs>
+          <w:tab w:val="clear" w:pos="420"/>
+        </w:tabs>
+        <w:ind w:left="1320" w:leftChars="0" w:hanging="420" w:firstLineChars="0"/>
+        <w:jc w:val="both"/>
+        <w:rPr>
+          <w:b w:val="0"/>
+          <w:bCs w:val="0"/>
+        </w:rPr>
+      </w:pPr>
+      <w:r>
+        <w:rPr>
+          <w:b w:val="0"/>
+          <w:bCs w:val="0"/>
+        </w:rPr>
+        <w:t>Spatial Reference: Integrated directory and map references, such as Melway coordinates</w:t>
+      </w:r>
+      <w:r>
+        <w:rPr>
+          <w:rFonts w:hint="default"/>
+          <w:b w:val="0"/>
+          <w:bCs w:val="0"/>
+          <w:lang w:val="en-US"/>
+        </w:rPr>
+        <w:t xml:space="preserve"> </w:t>
+      </w:r>
+      <w:r>
+        <w:rPr>
+          <w:b w:val="0"/>
+          <w:bCs w:val="0"/>
+        </w:rPr>
+        <w:t>which are essential for geographic verification and network analysis.</w:t>
+      </w:r>
+    </w:p>
+    <w:p>
+      <w:pPr>
+        <w:pStyle w:val="19"/>
+        <w:keepNext w:val="0"/>
+        <w:keepLines w:val="0"/>
+        <w:widowControl/>
+        <w:suppressLineNumbers w:val="0"/>
+        <w:ind w:left="440" w:leftChars="200" w:firstLine="0" w:firstLineChars="0"/>
+        <w:jc w:val="both"/>
+        <w:rPr>
+          <w:b w:val="0"/>
+          <w:bCs w:val="0"/>
+        </w:rPr>
+      </w:pPr>
+      <w:r>
+        <w:rPr>
+          <w:b w:val="0"/>
+          <w:bCs w:val="0"/>
+        </w:rPr>
+        <w:t>By i</w:t>
+      </w:r>
+      <w:r>
+        <w:rPr>
+          <w:rFonts w:hint="default"/>
+          <w:b w:val="0"/>
+          <w:bCs w:val="0"/>
+          <w:lang w:val="en-US"/>
+        </w:rPr>
+        <w:t>mplementing</w:t>
+      </w:r>
+      <w:r>
+        <w:rPr>
+          <w:b w:val="0"/>
+          <w:bCs w:val="0"/>
+        </w:rPr>
+        <w:t xml:space="preserve"> this directory, our team can transform raw IDs into meaningful geographic context</w:t>
+      </w:r>
+      <w:r>
+        <w:rPr>
+          <w:rFonts w:hint="default"/>
+          <w:b w:val="0"/>
+          <w:bCs w:val="0"/>
+          <w:lang w:val="en-US"/>
+        </w:rPr>
+        <w:t xml:space="preserve"> that</w:t>
+      </w:r>
+      <w:r>
+        <w:rPr>
+          <w:b w:val="0"/>
+          <w:bCs w:val="0"/>
+        </w:rPr>
+        <w:t xml:space="preserve"> process is vital to ensure the BLSTM model captures location-specific behaviors while verifying that all processed data is accurately tied to verified physical sites</w:t>
+      </w:r>
+    </w:p>
+    <w:p>
+      <w:pPr>
+        <w:pStyle w:val="4"/>
+        <w:bidi w:val="0"/>
+        <w:ind w:left="440" w:leftChars="200" w:firstLine="0" w:firstLineChars="0"/>
+        <w:rPr>
           <w:rFonts w:hint="default" w:cs="Times New Roman"/>
           <w:lang w:val="en-US"/>
         </w:rPr>
-        <w:t>B</w:t>
-      </w:r>
+      </w:pPr>
       <w:r>
         <w:rPr>
           <w:rFonts w:hint="default" w:ascii="Times New Roman" w:hAnsi="Times New Roman" w:cs="Times New Roman"/>
           <w:lang w:val="en-US"/>
         </w:rPr>
-        <w:t xml:space="preserve">: </w:t>
+        <w:t>2.1.</w:t>
       </w:r>
       <w:r>
         <w:rPr>
           <w:rFonts w:hint="default" w:cs="Times New Roman"/>
           <w:lang w:val="en-US"/>
         </w:rPr>
-        <w:t>Exploratory Data Analysis (EDA)</w:t>
-      </w:r>
-    </w:p>
-    <w:p>
-      <w:pPr>
-        <w:pStyle w:val="18"/>
+        <w:t>3 Road Classification and Hierachy</w:t>
+      </w:r>
+    </w:p>
+    <w:p>
+      <w:pPr>
+        <w:ind w:left="440" w:leftChars="200" w:firstLine="0" w:firstLineChars="0"/>
+        <w:jc w:val="both"/>
+        <w:rPr>
+          <w:rFonts w:hint="default" w:ascii="Times New Roman" w:hAnsi="Times New Roman" w:eastAsia="SimSun" w:cs="Times New Roman"/>
+          <w:sz w:val="25"/>
+          <w:szCs w:val="25"/>
+          <w:lang w:val="en-US"/>
+        </w:rPr>
+      </w:pPr>
+      <w:r>
+        <w:rPr>
+          <w:rFonts w:hint="default" w:ascii="Times New Roman" w:hAnsi="Times New Roman" w:eastAsia="SimSun" w:cs="Times New Roman"/>
+          <w:sz w:val="25"/>
+          <w:szCs w:val="25"/>
+        </w:rPr>
+        <w:t>Subsequently, the third metadata component</w:t>
+      </w:r>
+      <w:r>
+        <w:rPr>
+          <w:rFonts w:hint="default" w:ascii="Times New Roman" w:hAnsi="Times New Roman" w:eastAsia="SimSun" w:cs="Times New Roman"/>
+          <w:sz w:val="25"/>
+          <w:szCs w:val="25"/>
+          <w:lang w:val="en-US"/>
+        </w:rPr>
+        <w:t xml:space="preserve"> from second assignment </w:t>
+      </w:r>
+      <w:r>
+        <w:rPr>
+          <w:rFonts w:hint="default" w:ascii="Times New Roman" w:hAnsi="Times New Roman" w:eastAsia="SimSun" w:cs="Times New Roman"/>
+          <w:b/>
+          <w:bCs/>
+          <w:sz w:val="25"/>
+          <w:szCs w:val="25"/>
+        </w:rPr>
+        <w:t>Traffic_Count_Locations_with_LONG_LAT.csv</w:t>
+      </w:r>
+      <w:r>
+        <w:rPr>
+          <w:rFonts w:hint="default" w:ascii="Times New Roman" w:hAnsi="Times New Roman" w:eastAsia="SimSun" w:cs="Times New Roman"/>
+          <w:sz w:val="25"/>
+          <w:szCs w:val="25"/>
+        </w:rPr>
+        <w:t>, provid</w:t>
+      </w:r>
+      <w:r>
+        <w:rPr>
+          <w:rFonts w:hint="default" w:ascii="Times New Roman" w:hAnsi="Times New Roman" w:eastAsia="SimSun" w:cs="Times New Roman"/>
+          <w:sz w:val="25"/>
+          <w:szCs w:val="25"/>
+          <w:lang w:val="en-US"/>
+        </w:rPr>
+        <w:t>ing</w:t>
+      </w:r>
+      <w:r>
+        <w:rPr>
+          <w:rFonts w:hint="default" w:ascii="Times New Roman" w:hAnsi="Times New Roman" w:eastAsia="SimSun" w:cs="Times New Roman"/>
+          <w:sz w:val="25"/>
+          <w:szCs w:val="25"/>
+        </w:rPr>
+        <w:t xml:space="preserve"> technical specifications regarding road hierarchy and traffic volume capacity. </w:t>
+      </w:r>
+      <w:r>
+        <w:rPr>
+          <w:rFonts w:hint="default" w:ascii="Times New Roman" w:hAnsi="Times New Roman" w:eastAsia="SimSun" w:cs="Times New Roman"/>
+          <w:sz w:val="25"/>
+          <w:szCs w:val="25"/>
+          <w:lang w:val="en-US"/>
+        </w:rPr>
+        <w:t>Consequently, t</w:t>
+      </w:r>
+      <w:r>
+        <w:rPr>
+          <w:rFonts w:hint="default" w:ascii="Times New Roman" w:hAnsi="Times New Roman" w:eastAsia="SimSun" w:cs="Times New Roman"/>
+          <w:sz w:val="25"/>
+          <w:szCs w:val="25"/>
+        </w:rPr>
+        <w:t>his</w:t>
+      </w:r>
+      <w:r>
+        <w:rPr>
+          <w:rFonts w:hint="default" w:ascii="Times New Roman" w:hAnsi="Times New Roman" w:eastAsia="SimSun" w:cs="Times New Roman"/>
+          <w:sz w:val="25"/>
+          <w:szCs w:val="25"/>
+          <w:lang w:val="en-US"/>
+        </w:rPr>
+        <w:t xml:space="preserve"> approach</w:t>
+      </w:r>
+      <w:r>
+        <w:rPr>
+          <w:rFonts w:hint="default" w:ascii="Times New Roman" w:hAnsi="Times New Roman" w:eastAsia="SimSun" w:cs="Times New Roman"/>
+          <w:sz w:val="25"/>
+          <w:szCs w:val="25"/>
+        </w:rPr>
+        <w:t xml:space="preserve"> allows our team to categorize monitoring sites based on their strategic importance within the transport network. In particular, the key characteristics include:</w:t>
+      </w:r>
+    </w:p>
+    <w:p>
+      <w:pPr>
+        <w:pStyle w:val="19"/>
+        <w:keepNext w:val="0"/>
+        <w:keepLines w:val="0"/>
+        <w:widowControl/>
+        <w:numPr>
+          <w:ilvl w:val="0"/>
+          <w:numId w:val="4"/>
+        </w:numPr>
+        <w:suppressLineNumbers w:val="0"/>
+        <w:tabs>
+          <w:tab w:val="clear" w:pos="420"/>
+        </w:tabs>
+        <w:ind w:left="1320" w:leftChars="0" w:hanging="420" w:firstLineChars="0"/>
+        <w:jc w:val="both"/>
+        <w:rPr>
+          <w:b w:val="0"/>
+          <w:bCs w:val="0"/>
+        </w:rPr>
+      </w:pPr>
+      <w:r>
+        <w:rPr>
+          <w:b w:val="0"/>
+          <w:bCs w:val="0"/>
+        </w:rPr>
+        <w:t>Traffic Volume Metrics: Attributes such as AADT_ALLVE (Annual Average Daily Traffic) and AADT_TRUCK serve as baseline indicators for a road's typical load.</w:t>
+      </w:r>
+    </w:p>
+    <w:p>
+      <w:pPr>
+        <w:pStyle w:val="19"/>
+        <w:keepNext w:val="0"/>
+        <w:keepLines w:val="0"/>
+        <w:widowControl/>
+        <w:numPr>
+          <w:ilvl w:val="0"/>
+          <w:numId w:val="4"/>
+        </w:numPr>
+        <w:suppressLineNumbers w:val="0"/>
+        <w:tabs>
+          <w:tab w:val="clear" w:pos="420"/>
+        </w:tabs>
+        <w:ind w:left="1320" w:leftChars="0" w:hanging="420" w:firstLineChars="0"/>
+        <w:jc w:val="both"/>
+        <w:rPr>
+          <w:b w:val="0"/>
+          <w:bCs w:val="0"/>
+        </w:rPr>
+      </w:pPr>
+      <w:r>
+        <w:rPr>
+          <w:b w:val="0"/>
+          <w:bCs w:val="0"/>
+        </w:rPr>
+        <w:t>Road Hierarchy: Roads are classified into functional categories, namely "Highways," "Arterial Roads," or "Local Roads," via the DECLARED_R and LOCAL_ROAD attributes.</w:t>
+      </w:r>
+    </w:p>
+    <w:p>
+      <w:pPr>
+        <w:pStyle w:val="19"/>
+        <w:keepNext w:val="0"/>
+        <w:keepLines w:val="0"/>
+        <w:widowControl/>
+        <w:numPr>
+          <w:ilvl w:val="0"/>
+          <w:numId w:val="4"/>
+        </w:numPr>
+        <w:suppressLineNumbers w:val="0"/>
+        <w:tabs>
+          <w:tab w:val="clear" w:pos="420"/>
+        </w:tabs>
+        <w:ind w:left="1320" w:leftChars="0" w:hanging="420" w:firstLineChars="0"/>
+        <w:jc w:val="both"/>
+        <w:rPr>
+          <w:b w:val="0"/>
+          <w:bCs w:val="0"/>
+        </w:rPr>
+      </w:pPr>
+      <w:r>
+        <w:rPr>
+          <w:b w:val="0"/>
+          <w:bCs w:val="0"/>
+        </w:rPr>
+        <w:t>Geospatial Coordinates: The dataset provides precise Longitude (X) and Latitude (Y) data, enabling spatial mapping and distance-based analysis between sites.</w:t>
+      </w:r>
+    </w:p>
+    <w:p>
+      <w:pPr>
+        <w:pStyle w:val="19"/>
+        <w:keepNext w:val="0"/>
+        <w:keepLines w:val="0"/>
+        <w:widowControl/>
+        <w:numPr>
+          <w:ilvl w:val="0"/>
+          <w:numId w:val="4"/>
+        </w:numPr>
+        <w:suppressLineNumbers w:val="0"/>
+        <w:tabs>
+          <w:tab w:val="clear" w:pos="420"/>
+        </w:tabs>
+        <w:ind w:left="1320" w:leftChars="0" w:hanging="420" w:firstLineChars="0"/>
+        <w:jc w:val="both"/>
+        <w:rPr>
+          <w:b w:val="0"/>
+          <w:bCs w:val="0"/>
+        </w:rPr>
+      </w:pPr>
+      <w:r>
+        <w:rPr>
+          <w:b w:val="0"/>
+          <w:bCs w:val="0"/>
+        </w:rPr>
+        <w:t>Heavy Vehicle Impact: The inclusion of PER_TRUCKS (percentage of trucks) is vital for forecasting, as heavy vehicle patterns often differ from passenger car cycles.</w:t>
+      </w:r>
+    </w:p>
+    <w:p>
+      <w:pPr>
+        <w:ind w:left="440" w:leftChars="200" w:firstLine="0" w:firstLineChars="0"/>
+        <w:jc w:val="both"/>
+        <w:rPr>
+          <w:rFonts w:hint="default" w:ascii="Times New Roman" w:hAnsi="Times New Roman" w:eastAsia="SimSun" w:cs="Times New Roman"/>
+          <w:b w:val="0"/>
+          <w:bCs w:val="0"/>
+          <w:sz w:val="25"/>
+          <w:szCs w:val="25"/>
+          <w:lang w:val="en-US"/>
+        </w:rPr>
+      </w:pPr>
+      <w:r>
+        <w:rPr>
+          <w:rFonts w:hint="default" w:ascii="Times New Roman" w:hAnsi="Times New Roman" w:eastAsia="SimSun" w:cs="Times New Roman"/>
+          <w:b w:val="0"/>
+          <w:bCs w:val="0"/>
+          <w:sz w:val="25"/>
+          <w:szCs w:val="25"/>
+        </w:rPr>
+        <w:t>By integrating this road hierarchy data, models such as LSTM, GRU, and BLSTM can distinguish between different flow dynamics, such as the high-capacity flow of a Highway versus the lower volume of a Local Road. This ensures the model's predictions are grounded in the physical reality of the road network.</w:t>
+      </w:r>
+    </w:p>
+    <w:p>
+      <w:pPr>
+        <w:pStyle w:val="4"/>
+        <w:bidi w:val="0"/>
+        <w:ind w:left="440" w:leftChars="200" w:firstLine="0" w:firstLineChars="0"/>
+        <w:rPr>
+          <w:rFonts w:hint="default" w:ascii="Times New Roman" w:hAnsi="Times New Roman" w:cs="Times New Roman"/>
+          <w:b/>
+          <w:bCs/>
+          <w:i w:val="0"/>
+          <w:iCs w:val="0"/>
+          <w:sz w:val="26"/>
+          <w:szCs w:val="26"/>
+          <w:lang w:val="en-US"/>
+        </w:rPr>
+      </w:pPr>
+      <w:r>
+        <w:rPr>
+          <w:rFonts w:hint="default" w:ascii="Times New Roman" w:hAnsi="Times New Roman" w:cs="Times New Roman"/>
+          <w:lang w:val="en-US"/>
+        </w:rPr>
+        <w:t>2.1.</w:t>
+      </w:r>
+      <w:r>
+        <w:rPr>
+          <w:rFonts w:hint="default" w:cs="Times New Roman"/>
+          <w:lang w:val="en-US"/>
+        </w:rPr>
+        <w:t xml:space="preserve">4 </w:t>
+      </w:r>
+      <w:r>
+        <w:rPr>
+          <w:rFonts w:hint="default" w:ascii="Times New Roman" w:hAnsi="Times New Roman" w:cs="Times New Roman"/>
+          <w:b/>
+          <w:bCs/>
+          <w:i w:val="0"/>
+          <w:iCs w:val="0"/>
+          <w:sz w:val="26"/>
+          <w:szCs w:val="26"/>
+          <w:lang w:val="en-US"/>
+        </w:rPr>
+        <w:t xml:space="preserve">Raw </w:t>
+      </w:r>
+      <w:r>
+        <w:rPr>
+          <w:rFonts w:hint="default" w:cs="Times New Roman"/>
+          <w:b/>
+          <w:bCs/>
+          <w:i w:val="0"/>
+          <w:iCs w:val="0"/>
+          <w:sz w:val="26"/>
+          <w:szCs w:val="26"/>
+          <w:lang w:val="en-US"/>
+        </w:rPr>
+        <w:t>T</w:t>
+      </w:r>
+      <w:r>
+        <w:rPr>
+          <w:rFonts w:hint="default" w:ascii="Times New Roman" w:hAnsi="Times New Roman" w:cs="Times New Roman"/>
+          <w:b/>
+          <w:bCs/>
+          <w:i w:val="0"/>
+          <w:iCs w:val="0"/>
+          <w:sz w:val="26"/>
+          <w:szCs w:val="26"/>
+          <w:lang w:val="en-US"/>
+        </w:rPr>
+        <w:t>raffic Data Records</w:t>
+      </w:r>
+    </w:p>
+    <w:p>
+      <w:pPr>
+        <w:ind w:left="440" w:leftChars="200" w:firstLine="0" w:firstLineChars="0"/>
+        <w:jc w:val="both"/>
+        <w:rPr>
+          <w:rFonts w:hint="default" w:ascii="Times New Roman" w:hAnsi="Times New Roman"/>
+          <w:sz w:val="25"/>
+          <w:szCs w:val="25"/>
+          <w:lang w:val="en-US"/>
+        </w:rPr>
+      </w:pPr>
+      <w:r>
+        <w:rPr>
+          <w:rFonts w:hint="default" w:ascii="Times New Roman" w:hAnsi="Times New Roman" w:cs="Times New Roman"/>
+          <w:sz w:val="25"/>
+          <w:szCs w:val="25"/>
+          <w:lang w:val="en-US"/>
+        </w:rPr>
+        <w:t>Finally, the raw dataset includes traffic volume records from 40 SCATS sites in the Boroondara area, collected over a 31-day period in October 2006. Therefore, the data is structured as a time series with a high time resolution of 15-minute gaps, lead to 96 data points per site per day. Particularly, k</w:t>
+      </w:r>
+      <w:r>
+        <w:rPr>
+          <w:rFonts w:hint="default" w:ascii="Times New Roman" w:hAnsi="Times New Roman"/>
+          <w:sz w:val="25"/>
+          <w:szCs w:val="25"/>
+          <w:lang w:val="en-US"/>
+        </w:rPr>
+        <w:t>ey attributes in the raw records include:</w:t>
+      </w:r>
+    </w:p>
+    <w:p>
+      <w:pPr>
+        <w:numPr>
+          <w:ilvl w:val="0"/>
+          <w:numId w:val="5"/>
+        </w:numPr>
+        <w:tabs>
+          <w:tab w:val="clear" w:pos="420"/>
+        </w:tabs>
+        <w:ind w:left="1320" w:leftChars="0" w:hanging="420" w:firstLineChars="0"/>
+        <w:jc w:val="both"/>
+        <w:rPr>
+          <w:rFonts w:hint="default" w:ascii="Times New Roman" w:hAnsi="Times New Roman"/>
+          <w:sz w:val="25"/>
+          <w:szCs w:val="25"/>
+          <w:lang w:val="en-US"/>
+        </w:rPr>
+      </w:pPr>
+      <w:r>
+        <w:rPr>
+          <w:rFonts w:hint="default" w:ascii="Times New Roman" w:hAnsi="Times New Roman"/>
+          <w:sz w:val="25"/>
+          <w:szCs w:val="25"/>
+          <w:lang w:val="en-US"/>
+        </w:rPr>
+        <w:t>Space Identifiers: SCATS Site Number, Location (crossing descriptions), and Geographic Coordinates (Latitude/Longitude).</w:t>
+      </w:r>
+    </w:p>
+    <w:p>
+      <w:pPr>
+        <w:numPr>
+          <w:ilvl w:val="0"/>
+          <w:numId w:val="5"/>
+        </w:numPr>
+        <w:tabs>
+          <w:tab w:val="clear" w:pos="420"/>
+        </w:tabs>
+        <w:ind w:left="1320" w:leftChars="0" w:hanging="420" w:firstLineChars="0"/>
+        <w:jc w:val="both"/>
+        <w:rPr>
+          <w:rFonts w:hint="default" w:ascii="Times New Roman" w:hAnsi="Times New Roman"/>
+          <w:sz w:val="25"/>
+          <w:szCs w:val="25"/>
+          <w:lang w:val="en-US"/>
+        </w:rPr>
+      </w:pPr>
+      <w:r>
+        <w:rPr>
+          <w:rFonts w:hint="default" w:ascii="Times New Roman" w:hAnsi="Times New Roman"/>
+          <w:sz w:val="25"/>
+          <w:szCs w:val="25"/>
+          <w:lang w:val="en-US"/>
+        </w:rPr>
+        <w:t>Traffic Metrics: 15 minutes volume counts and Total Daily Volume.</w:t>
+      </w:r>
+    </w:p>
+    <w:p>
+      <w:pPr>
+        <w:numPr>
+          <w:ilvl w:val="0"/>
+          <w:numId w:val="5"/>
+        </w:numPr>
+        <w:tabs>
+          <w:tab w:val="clear" w:pos="420"/>
+        </w:tabs>
+        <w:ind w:left="1320" w:leftChars="0" w:hanging="420" w:firstLineChars="0"/>
+        <w:jc w:val="both"/>
+        <w:rPr>
+          <w:rFonts w:hint="default" w:ascii="Times New Roman" w:hAnsi="Times New Roman"/>
+          <w:sz w:val="25"/>
+          <w:szCs w:val="25"/>
+          <w:lang w:val="en-US"/>
+        </w:rPr>
+      </w:pPr>
+      <w:r>
+        <w:rPr>
+          <w:rFonts w:hint="default" w:ascii="Times New Roman" w:hAnsi="Times New Roman"/>
+          <w:sz w:val="25"/>
+          <w:szCs w:val="25"/>
+          <w:lang w:val="en-US"/>
+        </w:rPr>
+        <w:t>Data unity: Records for several sites including 970, 2000, 2820 as noted in the dataset metadata were marked as poor quality and cut out to ensure model accuracy.</w:t>
+      </w:r>
+    </w:p>
+    <w:p>
+      <w:pPr>
+        <w:ind w:left="440" w:leftChars="200" w:firstLine="0" w:firstLineChars="0"/>
+        <w:jc w:val="both"/>
+        <w:rPr>
+          <w:rFonts w:hint="default" w:ascii="Times New Roman" w:hAnsi="Times New Roman" w:cs="Times New Roman"/>
+          <w:sz w:val="25"/>
+          <w:szCs w:val="25"/>
+          <w:lang w:val="en-US"/>
+        </w:rPr>
+      </w:pPr>
+      <w:r>
+        <w:rPr>
+          <w:rFonts w:hint="default" w:ascii="Times New Roman" w:hAnsi="Times New Roman"/>
+          <w:sz w:val="25"/>
+          <w:szCs w:val="25"/>
+          <w:lang w:val="en-US"/>
+        </w:rPr>
+        <w:t>This raw data works as the main input for our LSTM and GRU models. However, it is necessary to adjust the coordinates manually during the preparation stage, because the initial map does not match with real-world intersections an important step to visualize the route correctly on the GUI.</w:t>
+      </w:r>
+    </w:p>
+    <w:p>
+      <w:pPr>
+        <w:jc w:val="both"/>
+        <w:rPr>
+          <w:rFonts w:hint="default" w:ascii="Times New Roman" w:hAnsi="Times New Roman" w:eastAsia="SimSun" w:cs="Times New Roman"/>
+          <w:b w:val="0"/>
+          <w:bCs w:val="0"/>
+          <w:i w:val="0"/>
+          <w:iCs w:val="0"/>
+          <w:sz w:val="24"/>
+          <w:szCs w:val="24"/>
+          <w:lang w:val="en-US"/>
+        </w:rPr>
+      </w:pPr>
+    </w:p>
+    <w:p>
+      <w:pPr>
+        <w:jc w:val="both"/>
+        <w:rPr>
+          <w:rFonts w:hint="default" w:ascii="Times New Roman" w:hAnsi="Times New Roman" w:eastAsia="SimSun" w:cs="Times New Roman"/>
+          <w:b w:val="0"/>
+          <w:bCs w:val="0"/>
+          <w:sz w:val="25"/>
+          <w:szCs w:val="25"/>
+          <w:lang w:val="en-US"/>
+        </w:rPr>
+      </w:pPr>
+    </w:p>
+    <w:p>
+      <w:pPr>
+        <w:pStyle w:val="19"/>
         <w:keepNext w:val="0"/>
         <w:keepLines w:val="0"/>
         <w:widowControl/>
@@ -3755,7 +5257,7 @@
       <w:fldChar w:fldCharType="separate"/>
     </w:r>
     <w:r>
-      <w:t>1/04/2026</w:t>
+      <w:t>2/04/2026</w:t>
     </w:r>
     <w:r>
       <w:fldChar w:fldCharType="end"/>
@@ -3990,6 +5492,50 @@
       </w:rPr>
     </w:lvl>
   </w:abstractNum>
+  <w:abstractNum w:abstractNumId="3">
+    <w:nsid w:val="1C4DD805"/>
+    <w:multiLevelType w:val="singleLevel"/>
+    <w:tmpl w:val="1C4DD805"/>
+    <w:lvl w:ilvl="0" w:tentative="0">
+      <w:start w:val="1"/>
+      <w:numFmt w:val="bullet"/>
+      <w:lvlText w:val=""/>
+      <w:lvlJc w:val="left"/>
+      <w:pPr>
+        <w:tabs>
+          <w:tab w:val="left" w:pos="420"/>
+        </w:tabs>
+        <w:ind w:left="420" w:leftChars="0" w:hanging="420" w:firstLineChars="0"/>
+      </w:pPr>
+      <w:rPr>
+        <w:rFonts w:hint="default" w:ascii="Wingdings" w:hAnsi="Wingdings"/>
+        <w:sz w:val="15"/>
+        <w:szCs w:val="15"/>
+      </w:rPr>
+    </w:lvl>
+  </w:abstractNum>
+  <w:abstractNum w:abstractNumId="4">
+    <w:nsid w:val="26B43211"/>
+    <w:multiLevelType w:val="singleLevel"/>
+    <w:tmpl w:val="26B43211"/>
+    <w:lvl w:ilvl="0" w:tentative="0">
+      <w:start w:val="1"/>
+      <w:numFmt w:val="bullet"/>
+      <w:lvlText w:val=""/>
+      <w:lvlJc w:val="left"/>
+      <w:pPr>
+        <w:tabs>
+          <w:tab w:val="left" w:pos="420"/>
+        </w:tabs>
+        <w:ind w:left="420" w:leftChars="0" w:hanging="420" w:firstLineChars="0"/>
+      </w:pPr>
+      <w:rPr>
+        <w:rFonts w:hint="default" w:ascii="Wingdings" w:hAnsi="Wingdings"/>
+        <w:sz w:val="15"/>
+        <w:szCs w:val="15"/>
+      </w:rPr>
+    </w:lvl>
+  </w:abstractNum>
   <w:num w:numId="1">
     <w:abstractNumId w:val="2"/>
   </w:num>
@@ -3998,6 +5544,12 @@
   </w:num>
   <w:num w:numId="3">
     <w:abstractNumId w:val="1"/>
+  </w:num>
+  <w:num w:numId="4">
+    <w:abstractNumId w:val="4"/>
+  </w:num>
+  <w:num w:numId="5">
+    <w:abstractNumId w:val="3"/>
   </w:num>
 </w:numbering>
 </file>
@@ -4280,7 +5832,7 @@
     <w:name w:val="heading 1"/>
     <w:basedOn w:val="1"/>
     <w:next w:val="1"/>
-    <w:link w:val="28"/>
+    <w:link w:val="29"/>
     <w:qFormat/>
     <w:uiPriority w:val="0"/>
     <w:pPr>
@@ -4473,6 +6025,18 @@
     </w:pPr>
   </w:style>
   <w:style w:type="character" w:styleId="17">
+    <w:name w:val="HTML Code"/>
+    <w:basedOn w:val="5"/>
+    <w:semiHidden/>
+    <w:unhideWhenUsed/>
+    <w:uiPriority w:val="99"/>
+    <w:rPr>
+      <w:rFonts w:ascii="Courier New" w:hAnsi="Courier New" w:cs="Courier New"/>
+      <w:sz w:val="20"/>
+      <w:szCs w:val="20"/>
+    </w:rPr>
+  </w:style>
+  <w:style w:type="character" w:styleId="18">
     <w:name w:val="Hyperlink"/>
     <w:basedOn w:val="5"/>
     <w:qFormat/>
@@ -4482,7 +6046,7 @@
       <w:u w:val="single"/>
     </w:rPr>
   </w:style>
-  <w:style w:type="paragraph" w:styleId="18">
+  <w:style w:type="paragraph" w:styleId="19">
     <w:name w:val="Normal (Web)"/>
     <w:basedOn w:val="1"/>
     <w:qFormat/>
@@ -4495,7 +6059,7 @@
       <w:sz w:val="24"/>
     </w:rPr>
   </w:style>
-  <w:style w:type="table" w:styleId="19">
+  <w:style w:type="table" w:styleId="20">
     <w:name w:val="Table Grid"/>
     <w:basedOn w:val="6"/>
     <w:qFormat/>
@@ -4517,7 +6081,7 @@
       </w:tblCellMar>
     </w:tblPr>
   </w:style>
-  <w:style w:type="paragraph" w:styleId="20">
+  <w:style w:type="paragraph" w:styleId="21">
     <w:name w:val="toc 1"/>
     <w:basedOn w:val="1"/>
     <w:next w:val="1"/>
@@ -4529,7 +6093,7 @@
       <w:sz w:val="36"/>
     </w:rPr>
   </w:style>
-  <w:style w:type="paragraph" w:styleId="21">
+  <w:style w:type="paragraph" w:styleId="22">
     <w:name w:val="toc 2"/>
     <w:basedOn w:val="1"/>
     <w:next w:val="1"/>
@@ -4541,7 +6105,7 @@
       <w:ind w:left="220"/>
     </w:pPr>
   </w:style>
-  <w:style w:type="paragraph" w:customStyle="1" w:styleId="22">
+  <w:style w:type="paragraph" w:customStyle="1" w:styleId="23">
     <w:name w:val="Equation"/>
     <w:basedOn w:val="1"/>
     <w:qFormat/>
@@ -4554,7 +6118,7 @@
       <w:szCs w:val="20"/>
     </w:rPr>
   </w:style>
-  <w:style w:type="paragraph" w:customStyle="1" w:styleId="23">
+  <w:style w:type="paragraph" w:customStyle="1" w:styleId="24">
     <w:name w:val="Front Page"/>
     <w:basedOn w:val="2"/>
     <w:qFormat/>
@@ -4567,7 +6131,7 @@
       <w:szCs w:val="20"/>
     </w:rPr>
   </w:style>
-  <w:style w:type="paragraph" w:customStyle="1" w:styleId="24">
+  <w:style w:type="paragraph" w:customStyle="1" w:styleId="25">
     <w:name w:val="Section Heading"/>
     <w:basedOn w:val="2"/>
     <w:qFormat/>
@@ -4580,7 +6144,7 @@
       <w:sz w:val="44"/>
     </w:rPr>
   </w:style>
-  <w:style w:type="paragraph" w:customStyle="1" w:styleId="25">
+  <w:style w:type="paragraph" w:customStyle="1" w:styleId="26">
     <w:name w:val="WPSOffice手动目录 1"/>
     <w:qFormat/>
     <w:uiPriority w:val="0"/>
@@ -4593,7 +6157,7 @@
       <w:szCs w:val="20"/>
     </w:rPr>
   </w:style>
-  <w:style w:type="paragraph" w:customStyle="1" w:styleId="26">
+  <w:style w:type="paragraph" w:customStyle="1" w:styleId="27">
     <w:name w:val="WPSOffice手动目录 2"/>
     <w:qFormat/>
     <w:uiPriority w:val="0"/>
@@ -4606,7 +6170,7 @@
       <w:szCs w:val="20"/>
     </w:rPr>
   </w:style>
-  <w:style w:type="paragraph" w:customStyle="1" w:styleId="27">
+  <w:style w:type="paragraph" w:customStyle="1" w:styleId="28">
     <w:name w:val="WPSOffice手动目录 3"/>
     <w:qFormat/>
     <w:uiPriority w:val="0"/>
@@ -4619,7 +6183,7 @@
       <w:szCs w:val="20"/>
     </w:rPr>
   </w:style>
-  <w:style w:type="character" w:customStyle="1" w:styleId="28">
+  <w:style w:type="character" w:customStyle="1" w:styleId="29">
     <w:name w:val="Heading 1 Char"/>
     <w:link w:val="2"/>
     <w:qFormat/>
@@ -4918,4 +6482,23 @@
   </a:themeElements>
   <a:objectDefaults/>
 </a:theme>
+</file>
+
+<file path=customXml/item1.xml><?xml version="1.0" encoding="utf-8"?>
+<s:customData xmlns="http://www.wps.cn/officeDocument/2013/wpsCustomData" xmlns:s="http://www.wps.cn/officeDocument/2013/wpsCustomData">
+  <customSectProps>
+    <customSectPr/>
+  </customSectProps>
+  <customShpExts>
+    <customShpInfo spid="_x0000_s1026" textRotate="1"/>
+  </customShpExts>
+</s:customData>
+</file>
+
+<file path=customXml/itemProps1.xml><?xml version="1.0" encoding="utf-8"?>
+<ds:datastoreItem xmlns:ds="http://schemas.openxmlformats.org/officeDocument/2006/customXml" ds:itemID="{B1977F7D-205B-4081-913C-38D41E755F92}">
+  <ds:schemaRefs>
+    <ds:schemaRef ds:uri="http://www.wps.cn/officeDocument/2013/wpsCustomData"/>
+  </ds:schemaRefs>
+</ds:datastoreItem>
 </file>
</xml_diff>